<commit_message>
feat: punto 3 y 3.1 subte
</commit_message>
<xml_diff>
--- a/Archivos finales/TP_Series_Temporales.docx
+++ b/Archivos finales/TP_Series_Temporales.docx
@@ -207,7 +207,7 @@
                     <v:stroke joinstyle="miter"/>
                     <v:path gradientshapeok="t" o:connecttype="rect"/>
                   </v:shapetype>
-                  <v:shape id="Text Box 3" o:spid="_x0000_s1026" type="#_x0000_t202" style="position:absolute;margin-left:-9.45pt;margin-top:375.35pt;width:444pt;height:34.3pt;z-index:251658242;visibility:visible;mso-wrap-style:square;mso-width-percent:0;mso-height-percent:0;mso-wrap-distance-left:9pt;mso-wrap-distance-top:0;mso-wrap-distance-right:9pt;mso-wrap-distance-bottom:0;mso-position-horizontal:absolute;mso-position-horizontal-relative:text;mso-position-vertical:absolute;mso-position-vertical-relative:text;mso-width-percent:0;mso-height-percent:0;mso-width-relative:margin;mso-height-relative:margin;v-text-anchor:top" o:gfxdata="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" filled="f" stroked="f" strokeweight=".5pt">
+                  <v:shape id="Text Box 3" o:spid="_x0000_s1026" type="#_x0000_t202" style="position:absolute;margin-left:-9.45pt;margin-top:375.35pt;width:444pt;height:34.3pt;z-index:251658242;visibility:visible;mso-wrap-style:square;mso-width-percent:0;mso-height-percent:0;mso-wrap-distance-left:9pt;mso-wrap-distance-top:0;mso-wrap-distance-right:9pt;mso-wrap-distance-bottom:0;mso-position-horizontal:absolute;mso-position-horizontal-relative:text;mso-position-vertical:absolute;mso-position-vertical-relative:text;mso-width-percent:0;mso-height-percent:0;mso-width-relative:margin;mso-height-relative:margin;v-text-anchor:top" o:gfxdata="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" filled="f" stroked="f" strokeweight=".5pt">
                     <v:textbox>
                       <w:txbxContent>
                         <w:p>
@@ -411,7 +411,7 @@
               </mc:Choice>
               <mc:Fallback>
                 <w:pict>
-                  <v:shape w14:anchorId="13B4A4AB" id="_x0000_s1027" type="#_x0000_t202" style="position:absolute;margin-left:-9.4pt;margin-top:434.45pt;width:444pt;height:88.3pt;z-index:251658243;visibility:visible;mso-wrap-style:square;mso-width-percent:0;mso-height-percent:0;mso-wrap-distance-left:9pt;mso-wrap-distance-top:0;mso-wrap-distance-right:9pt;mso-wrap-distance-bottom:0;mso-position-horizontal:absolute;mso-position-horizontal-relative:text;mso-position-vertical:absolute;mso-position-vertical-relative:text;mso-width-percent:0;mso-height-percent:0;mso-width-relative:margin;mso-height-relative:margin;v-text-anchor:top" o:gfxdata="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" filled="f" stroked="f" strokeweight=".5pt">
+                  <v:shape w14:anchorId="13B4A4AB" id="_x0000_s1027" type="#_x0000_t202" style="position:absolute;margin-left:-9.4pt;margin-top:434.45pt;width:444pt;height:88.3pt;z-index:251658243;visibility:visible;mso-wrap-style:square;mso-width-percent:0;mso-height-percent:0;mso-wrap-distance-left:9pt;mso-wrap-distance-top:0;mso-wrap-distance-right:9pt;mso-wrap-distance-bottom:0;mso-position-horizontal:absolute;mso-position-horizontal-relative:text;mso-position-vertical:absolute;mso-position-vertical-relative:text;mso-width-percent:0;mso-height-percent:0;mso-width-relative:margin;mso-height-relative:margin;v-text-anchor:top" o:gfxdata="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" filled="f" stroked="f" strokeweight=".5pt">
                     <v:textbox>
                       <w:txbxContent>
                         <w:p>
@@ -640,7 +640,7 @@
               </mc:Choice>
               <mc:Fallback>
                 <w:pict>
-                  <v:shape w14:anchorId="6F09AC45" id="Text Box 75" o:spid="_x0000_s1028" type="#_x0000_t202" style="position:absolute;margin-left:-4.6pt;margin-top:426.5pt;width:476.65pt;height:62.85pt;z-index:251658240;visibility:visible;mso-wrap-style:square;mso-width-percent:0;mso-height-percent:0;mso-wrap-distance-left:14.4pt;mso-wrap-distance-top:0;mso-wrap-distance-right:14.4pt;mso-wrap-distance-bottom:0;mso-position-horizontal:absolute;mso-position-horizontal-relative:margin;mso-position-vertical:absolute;mso-position-vertical-relative:page;mso-width-percent:0;mso-height-percent:0;mso-width-relative:margin;mso-height-relative:page;v-text-anchor:top" o:gfxdata="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" filled="f" stroked="f" strokeweight=".5pt">
+                  <v:shape w14:anchorId="6F09AC45" id="Text Box 75" o:spid="_x0000_s1028" type="#_x0000_t202" style="position:absolute;margin-left:-4.6pt;margin-top:426.5pt;width:476.65pt;height:62.85pt;z-index:251658240;visibility:visible;mso-wrap-style:square;mso-width-percent:0;mso-height-percent:0;mso-wrap-distance-left:14.4pt;mso-wrap-distance-top:0;mso-wrap-distance-right:14.4pt;mso-wrap-distance-bottom:0;mso-position-horizontal:absolute;mso-position-horizontal-relative:margin;mso-position-vertical:absolute;mso-position-vertical-relative:page;mso-width-percent:0;mso-height-percent:0;mso-width-relative:margin;mso-height-relative:page;v-text-anchor:top" o:gfxdata="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" filled="f" stroked="f" strokeweight=".5pt">
                     <v:textbox inset="0,0,0,0">
                       <w:txbxContent>
                         <w:p>
@@ -722,8 +722,8 @@
           <w:b/>
           <w:bCs/>
           <w:color w:val="152186"/>
-          <w:sz w:val="36"/>
-          <w:szCs w:val="36"/>
+          <w:sz w:val="28"/>
+          <w:szCs w:val="28"/>
         </w:rPr>
       </w:pPr>
       <w:r>
@@ -732,9 +732,10 @@
           <w:b/>
           <w:bCs/>
           <w:color w:val="152186"/>
-          <w:sz w:val="36"/>
-          <w:szCs w:val="36"/>
-        </w:rPr>
+          <w:sz w:val="28"/>
+          <w:szCs w:val="28"/>
+        </w:rPr>
+        <w:lastRenderedPageBreak/>
         <w:t>Resumen Ejecutivo</w:t>
       </w:r>
     </w:p>
@@ -764,8 +765,8 @@
           <w:b/>
           <w:bCs/>
           <w:color w:val="152186"/>
-          <w:sz w:val="36"/>
-          <w:szCs w:val="36"/>
+          <w:sz w:val="28"/>
+          <w:szCs w:val="28"/>
         </w:rPr>
       </w:pPr>
       <w:r>
@@ -774,8 +775,8 @@
           <w:b/>
           <w:bCs/>
           <w:color w:val="152186"/>
-          <w:sz w:val="36"/>
-          <w:szCs w:val="36"/>
+          <w:sz w:val="28"/>
+          <w:szCs w:val="28"/>
         </w:rPr>
         <w:t>Tabla de contenido</w:t>
       </w:r>
@@ -794,8 +795,8 @@
           <w:b/>
           <w:bCs/>
           <w:color w:val="152186"/>
-          <w:sz w:val="36"/>
-          <w:szCs w:val="36"/>
+          <w:sz w:val="28"/>
+          <w:szCs w:val="28"/>
         </w:rPr>
       </w:pPr>
       <w:r>
@@ -804,8 +805,8 @@
           <w:b/>
           <w:bCs/>
           <w:color w:val="152186"/>
-          <w:sz w:val="36"/>
-          <w:szCs w:val="36"/>
+          <w:sz w:val="28"/>
+          <w:szCs w:val="28"/>
         </w:rPr>
         <w:t>Introducción</w:t>
       </w:r>
@@ -829,21 +830,1319 @@
     </w:p>
     <w:p>
       <w:pPr>
+        <w:pStyle w:val="Heading1"/>
+        <w:spacing w:before="240"/>
+        <w:rPr>
+          <w:rFonts w:ascii="Century Gothic" w:hAnsi="Century Gothic"/>
+          <w:b/>
+          <w:bCs/>
+          <w:color w:val="152186"/>
+          <w:sz w:val="28"/>
+          <w:szCs w:val="28"/>
+        </w:rPr>
+      </w:pPr>
+      <w:r>
+        <w:rPr>
+          <w:rFonts w:ascii="Century Gothic" w:hAnsi="Century Gothic"/>
+          <w:b/>
+          <w:bCs/>
+          <w:color w:val="152186"/>
+          <w:sz w:val="28"/>
+          <w:szCs w:val="28"/>
+        </w:rPr>
+        <w:t xml:space="preserve">Funciones de </w:t>
+      </w:r>
+      <w:r>
+        <w:rPr>
+          <w:rFonts w:ascii="Century Gothic" w:hAnsi="Century Gothic"/>
+          <w:b/>
+          <w:bCs/>
+          <w:color w:val="152186"/>
+          <w:sz w:val="28"/>
+          <w:szCs w:val="28"/>
+        </w:rPr>
+        <w:t>A</w:t>
+      </w:r>
+      <w:r>
+        <w:rPr>
+          <w:rFonts w:ascii="Century Gothic" w:hAnsi="Century Gothic"/>
+          <w:b/>
+          <w:bCs/>
+          <w:color w:val="152186"/>
+          <w:sz w:val="28"/>
+          <w:szCs w:val="28"/>
+        </w:rPr>
+        <w:t xml:space="preserve">utocorrelación </w:t>
+      </w:r>
+      <w:r>
+        <w:rPr>
+          <w:rFonts w:ascii="Century Gothic" w:hAnsi="Century Gothic"/>
+          <w:b/>
+          <w:bCs/>
+          <w:color w:val="152186"/>
+          <w:sz w:val="28"/>
+          <w:szCs w:val="28"/>
+        </w:rPr>
+        <w:t>y Autocorrelación Parcial</w:t>
+      </w:r>
+    </w:p>
+    <w:p>
+      <w:pPr>
         <w:spacing w:line="276" w:lineRule="auto"/>
         <w:jc w:val="both"/>
         <w:rPr>
-          <w:sz w:val="22"/>
-          <w:szCs w:val="22"/>
-        </w:rPr>
-      </w:pPr>
-    </w:p>
-    <w:p>
-      <w:pPr>
-        <w:rPr>
-          <w:sz w:val="22"/>
-          <w:szCs w:val="22"/>
-        </w:rPr>
-      </w:pPr>
+          <w:i/>
+          <w:iCs/>
+          <w:color w:val="747474" w:themeColor="background2" w:themeShade="80"/>
+          <w:sz w:val="22"/>
+          <w:szCs w:val="22"/>
+        </w:rPr>
+      </w:pPr>
+      <w:r>
+        <w:rPr>
+          <w:i/>
+          <w:iCs/>
+          <w:color w:val="747474" w:themeColor="background2" w:themeShade="80"/>
+          <w:sz w:val="22"/>
+          <w:szCs w:val="22"/>
+        </w:rPr>
+        <w:t>Graficar la FAS, FAC y FACP de las mismas en un solo gráfico y analizarlas. ¿Qué puede inferir de los gráficos? Justificar con teoría</w:t>
+      </w:r>
+      <w:r>
+        <w:rPr>
+          <w:i/>
+          <w:iCs/>
+          <w:color w:val="747474" w:themeColor="background2" w:themeShade="80"/>
+          <w:sz w:val="22"/>
+          <w:szCs w:val="22"/>
+        </w:rPr>
+        <w:t xml:space="preserve">. </w:t>
+      </w:r>
+    </w:p>
+    <w:p>
+      <w:pPr>
+        <w:spacing w:line="276" w:lineRule="auto"/>
+        <w:jc w:val="both"/>
+        <w:rPr>
+          <w:sz w:val="22"/>
+          <w:szCs w:val="22"/>
+        </w:rPr>
+      </w:pPr>
+      <w:commentRangeStart w:id="0"/>
+      <w:r>
+        <w:rPr>
+          <w:sz w:val="22"/>
+          <w:szCs w:val="22"/>
+        </w:rPr>
+        <w:t xml:space="preserve">Para identificar la estructura del modelo ARIMA, se utilizan </w:t>
+      </w:r>
+      <w:r>
+        <w:rPr>
+          <w:sz w:val="22"/>
+          <w:szCs w:val="22"/>
+        </w:rPr>
+        <w:t xml:space="preserve">las herramientas complementarias: </w:t>
+      </w:r>
+      <w:r>
+        <w:rPr>
+          <w:sz w:val="22"/>
+          <w:szCs w:val="22"/>
+        </w:rPr>
+        <w:t>la Función de Autocorrelació</w:t>
+      </w:r>
+      <w:r>
+        <w:rPr>
+          <w:sz w:val="22"/>
+          <w:szCs w:val="22"/>
+        </w:rPr>
+        <w:t xml:space="preserve">n </w:t>
+      </w:r>
+      <w:r>
+        <w:rPr>
+          <w:sz w:val="22"/>
+          <w:szCs w:val="22"/>
+        </w:rPr>
+        <w:t>Simple (FAS), la Función de Autocorrelació</w:t>
+      </w:r>
+      <w:r>
+        <w:rPr>
+          <w:sz w:val="22"/>
+          <w:szCs w:val="22"/>
+        </w:rPr>
+        <w:t>n</w:t>
+      </w:r>
+      <w:r>
+        <w:rPr>
+          <w:sz w:val="22"/>
+          <w:szCs w:val="22"/>
+        </w:rPr>
+        <w:t xml:space="preserve"> (FAC) y la Función de Autocorrelació</w:t>
+      </w:r>
+      <w:r>
+        <w:rPr>
+          <w:sz w:val="22"/>
+          <w:szCs w:val="22"/>
+        </w:rPr>
+        <w:t>n</w:t>
+      </w:r>
+      <w:r>
+        <w:rPr>
+          <w:sz w:val="22"/>
+          <w:szCs w:val="22"/>
+        </w:rPr>
+        <w:t xml:space="preserve"> Parcial (FACP).</w:t>
+      </w:r>
+    </w:p>
+    <w:p>
+      <w:pPr>
+        <w:pStyle w:val="ListParagraph"/>
+        <w:numPr>
+          <w:ilvl w:val="0"/>
+          <w:numId w:val="11"/>
+        </w:numPr>
+        <w:spacing w:line="276" w:lineRule="auto"/>
+        <w:jc w:val="both"/>
+        <w:rPr>
+          <w:sz w:val="22"/>
+          <w:szCs w:val="22"/>
+        </w:rPr>
+      </w:pPr>
+      <w:r>
+        <w:rPr>
+          <w:sz w:val="22"/>
+          <w:szCs w:val="22"/>
+        </w:rPr>
+        <w:t xml:space="preserve">La FAC es utilizada para medir la correlación linear entre una serie y sus propios rezagos, </w:t>
+      </w:r>
+      <w:r>
+        <w:rPr>
+          <w:sz w:val="22"/>
+          <w:szCs w:val="22"/>
+        </w:rPr>
+        <w:t>siendo el coeficiente de autocorrelación de orden k definida formalmente como:</w:t>
+      </w:r>
+    </w:p>
+    <w:p>
+      <w:pPr>
+        <w:spacing w:line="276" w:lineRule="auto"/>
+        <w:ind w:left="720" w:firstLine="720"/>
+        <w:jc w:val="both"/>
+        <w:rPr>
+          <w:sz w:val="22"/>
+          <w:szCs w:val="22"/>
+        </w:rPr>
+      </w:pPr>
+      <w:r>
+        <w:rPr>
+          <w:sz w:val="22"/>
+          <w:szCs w:val="22"/>
+          <w:highlight w:val="yellow"/>
+        </w:rPr>
+        <w:t>FORMULA FAC</w:t>
+      </w:r>
+    </w:p>
+    <w:p>
+      <w:pPr>
+        <w:pStyle w:val="ListParagraph"/>
+        <w:spacing w:line="276" w:lineRule="auto"/>
+        <w:jc w:val="both"/>
+        <w:rPr>
+          <w:sz w:val="22"/>
+          <w:szCs w:val="22"/>
+        </w:rPr>
+      </w:pPr>
+      <w:r>
+        <w:rPr>
+          <w:sz w:val="22"/>
+          <w:szCs w:val="22"/>
+        </w:rPr>
+        <w:t xml:space="preserve">Cuando la FAC decae lentamente hacia cero, indica presencia de una raíz unitaria volviendo a la serie en no estacionaria. </w:t>
+      </w:r>
+      <w:r>
+        <w:rPr>
+          <w:sz w:val="22"/>
+          <w:szCs w:val="22"/>
+        </w:rPr>
+        <w:t xml:space="preserve">Mientras que la presencia de picos significativos en rezagos múltiplos de s (en este trabajo s=12) indica </w:t>
+      </w:r>
+      <w:r>
+        <w:rPr>
+          <w:sz w:val="22"/>
+          <w:szCs w:val="22"/>
+        </w:rPr>
+        <w:t xml:space="preserve">estacionalidad anual. </w:t>
+      </w:r>
+    </w:p>
+    <w:p>
+      <w:pPr>
+        <w:pStyle w:val="ListParagraph"/>
+        <w:spacing w:line="276" w:lineRule="auto"/>
+        <w:jc w:val="both"/>
+        <w:rPr>
+          <w:sz w:val="22"/>
+          <w:szCs w:val="22"/>
+        </w:rPr>
+      </w:pPr>
+    </w:p>
+    <w:p>
+      <w:pPr>
+        <w:pStyle w:val="ListParagraph"/>
+        <w:numPr>
+          <w:ilvl w:val="0"/>
+          <w:numId w:val="11"/>
+        </w:numPr>
+        <w:spacing w:line="276" w:lineRule="auto"/>
+        <w:jc w:val="both"/>
+        <w:rPr>
+          <w:sz w:val="22"/>
+          <w:szCs w:val="22"/>
+        </w:rPr>
+      </w:pPr>
+      <w:r>
+        <w:rPr>
+          <w:sz w:val="22"/>
+          <w:szCs w:val="22"/>
+        </w:rPr>
+        <w:t xml:space="preserve">La FACP mide la correlación direcya entre </w:t>
+      </w:r>
+      <w:r>
+        <w:rPr>
+          <w:sz w:val="22"/>
+          <w:szCs w:val="22"/>
+        </w:rPr>
+        <w:t>X</w:t>
+      </w:r>
+      <w:r>
+        <w:rPr>
+          <w:sz w:val="22"/>
+          <w:szCs w:val="22"/>
+          <w:vertAlign w:val="subscript"/>
+        </w:rPr>
+        <w:t>t</w:t>
+      </w:r>
+      <w:r>
+        <w:rPr>
+          <w:sz w:val="22"/>
+          <w:szCs w:val="22"/>
+        </w:rPr>
+        <w:t xml:space="preserve"> y X</w:t>
+      </w:r>
+      <w:r>
+        <w:rPr>
+          <w:sz w:val="22"/>
+          <w:szCs w:val="22"/>
+          <w:vertAlign w:val="subscript"/>
+        </w:rPr>
+        <w:t>t-</w:t>
+      </w:r>
+      <w:r>
+        <w:rPr>
+          <w:sz w:val="22"/>
+          <w:szCs w:val="22"/>
+          <w:vertAlign w:val="subscript"/>
+        </w:rPr>
+        <w:t>1</w:t>
+      </w:r>
+      <w:r>
+        <w:rPr>
+          <w:sz w:val="22"/>
+          <w:szCs w:val="22"/>
+        </w:rPr>
+        <w:t xml:space="preserve">, eliminando el </w:t>
+      </w:r>
+      <w:r>
+        <w:rPr>
+          <w:sz w:val="22"/>
+          <w:szCs w:val="22"/>
+        </w:rPr>
+        <w:t xml:space="preserve">efecto lineal de los rezagos intermedios </w:t>
+      </w:r>
+    </w:p>
+    <w:p>
+      <w:pPr>
+        <w:spacing w:line="276" w:lineRule="auto"/>
+        <w:jc w:val="both"/>
+        <w:rPr>
+          <w:sz w:val="22"/>
+          <w:szCs w:val="22"/>
+        </w:rPr>
+      </w:pPr>
+      <w:r>
+        <w:rPr>
+          <w:sz w:val="22"/>
+          <w:szCs w:val="22"/>
+        </w:rPr>
+        <w:t>La **FACP** mide la correlación *directa* entre $X_t$ y $X_{t-k}$, eliminando el efecto lineal de los rezagos intermedios $X_{t-1}, \ldots, X_{t-k+1}$. Se define como el coeficiente $\phi_{kk}$ de la regresión de $X_t$ sobre sus *k* rezagos anteriores (Peña, 2005). Una FACP que se trunca en el rezago *p* es característica de un proceso AR(*p*); si decae de manera exponencial o sinusoidal, sugiere un proceso MA.</w:t>
+      </w:r>
+    </w:p>
+    <w:p>
+      <w:pPr>
+        <w:spacing w:line="276" w:lineRule="auto"/>
+        <w:jc w:val="both"/>
+        <w:rPr>
+          <w:sz w:val="22"/>
+          <w:szCs w:val="22"/>
+        </w:rPr>
+      </w:pPr>
+      <w:r>
+        <w:rPr>
+          <w:sz w:val="22"/>
+          <w:szCs w:val="22"/>
+        </w:rPr>
+        <w:t>Las bandas de confianza graficadas corresponden al intervalo $\pm 1.96/\sqrt{T}$ (nivel 95%). Correlaciones que exceden estas bandas son estadísticamente significativas y deben ser consideradas en la especificación del modelo.</w:t>
+      </w:r>
+      <w:commentRangeEnd w:id="0"/>
+      <w:r>
+        <w:rPr>
+          <w:rStyle w:val="CommentReference"/>
+        </w:rPr>
+        <w:commentReference w:id="0"/>
+      </w:r>
+    </w:p>
+    <w:p>
+      <w:pPr>
+        <w:pStyle w:val="Heading2"/>
+        <w:rPr>
+          <w:rFonts w:ascii="Century Gothic" w:hAnsi="Century Gothic"/>
+          <w:b/>
+          <w:bCs/>
+          <w:color w:val="152186"/>
+          <w:sz w:val="22"/>
+          <w:szCs w:val="22"/>
+        </w:rPr>
+      </w:pPr>
+      <w:r>
+        <w:rPr>
+          <w:rFonts w:ascii="Century Gothic" w:hAnsi="Century Gothic"/>
+          <w:b/>
+          <w:bCs/>
+          <w:color w:val="152186"/>
+          <w:sz w:val="22"/>
+          <w:szCs w:val="22"/>
+        </w:rPr>
+        <w:lastRenderedPageBreak/>
+        <w:t>Análisis serie Subte – pasajeros mensuales</w:t>
+      </w:r>
+    </w:p>
+    <w:p>
+      <w:pPr>
+        <w:pStyle w:val="Heading2"/>
+        <w:jc w:val="both"/>
+        <w:rPr>
+          <w:rFonts w:asciiTheme="minorHAnsi" w:eastAsiaTheme="minorHAnsi" w:hAnsiTheme="minorHAnsi" w:cstheme="minorBidi"/>
+          <w:color w:val="auto"/>
+          <w:sz w:val="22"/>
+          <w:szCs w:val="22"/>
+        </w:rPr>
+      </w:pPr>
+      <w:r>
+        <w:rPr>
+          <w:rFonts w:asciiTheme="minorHAnsi" w:eastAsiaTheme="minorHAnsi" w:hAnsiTheme="minorHAnsi" w:cstheme="minorBidi"/>
+          <w:color w:val="auto"/>
+          <w:sz w:val="22"/>
+          <w:szCs w:val="22"/>
+        </w:rPr>
+        <w:t xml:space="preserve">Al realizar el análisis de la serie </w:t>
+      </w:r>
+      <w:r>
+        <w:rPr>
+          <w:rFonts w:asciiTheme="minorHAnsi" w:eastAsiaTheme="minorHAnsi" w:hAnsiTheme="minorHAnsi" w:cstheme="minorBidi"/>
+          <w:color w:val="auto"/>
+          <w:sz w:val="22"/>
+          <w:szCs w:val="22"/>
+        </w:rPr>
+        <w:t xml:space="preserve">original, </w:t>
+      </w:r>
+      <w:r>
+        <w:rPr>
+          <w:rFonts w:asciiTheme="minorHAnsi" w:eastAsiaTheme="minorHAnsi" w:hAnsiTheme="minorHAnsi" w:cstheme="minorBidi"/>
+          <w:color w:val="auto"/>
+          <w:sz w:val="22"/>
+          <w:szCs w:val="22"/>
+        </w:rPr>
+        <w:t>la FAC presenta</w:t>
+      </w:r>
+      <w:r>
+        <w:rPr>
+          <w:rFonts w:asciiTheme="minorHAnsi" w:eastAsiaTheme="minorHAnsi" w:hAnsiTheme="minorHAnsi" w:cstheme="minorBidi"/>
+          <w:color w:val="auto"/>
+          <w:sz w:val="22"/>
+          <w:szCs w:val="22"/>
+        </w:rPr>
+        <w:t xml:space="preserve"> un decaimiento lento desde un valor inicial </w:t>
+      </w:r>
+      <w:r>
+        <w:rPr>
+          <w:rFonts w:asciiTheme="minorHAnsi" w:eastAsiaTheme="minorHAnsi" w:hAnsiTheme="minorHAnsi" w:cstheme="minorBidi"/>
+          <w:color w:val="auto"/>
+          <w:sz w:val="22"/>
+          <w:szCs w:val="22"/>
+        </w:rPr>
+        <w:t>de ~0.9</w:t>
+      </w:r>
+      <w:r>
+        <w:rPr>
+          <w:rFonts w:asciiTheme="minorHAnsi" w:eastAsiaTheme="minorHAnsi" w:hAnsiTheme="minorHAnsi" w:cstheme="minorBidi"/>
+          <w:color w:val="auto"/>
+          <w:sz w:val="22"/>
+          <w:szCs w:val="22"/>
+        </w:rPr>
+        <w:t xml:space="preserve"> que se mantiene positiva y </w:t>
+      </w:r>
+      <w:r>
+        <w:rPr>
+          <w:rFonts w:asciiTheme="minorHAnsi" w:eastAsiaTheme="minorHAnsi" w:hAnsiTheme="minorHAnsi" w:cstheme="minorBidi"/>
+          <w:color w:val="auto"/>
+          <w:sz w:val="22"/>
+          <w:szCs w:val="22"/>
+        </w:rPr>
+        <w:t xml:space="preserve">significativa durante más de 20 rezagos. Este patrón confirma </w:t>
+      </w:r>
+      <w:r>
+        <w:rPr>
+          <w:rFonts w:asciiTheme="minorHAnsi" w:eastAsiaTheme="minorHAnsi" w:hAnsiTheme="minorHAnsi" w:cstheme="minorBidi"/>
+          <w:color w:val="auto"/>
+          <w:sz w:val="22"/>
+          <w:szCs w:val="22"/>
+        </w:rPr>
+        <w:t xml:space="preserve">la presencia de una </w:t>
+      </w:r>
+      <w:r>
+        <w:rPr>
+          <w:rFonts w:asciiTheme="minorHAnsi" w:eastAsiaTheme="minorHAnsi" w:hAnsiTheme="minorHAnsi" w:cstheme="minorBidi"/>
+          <w:b/>
+          <w:bCs/>
+          <w:i/>
+          <w:iCs/>
+          <w:color w:val="auto"/>
+          <w:sz w:val="22"/>
+          <w:szCs w:val="22"/>
+        </w:rPr>
+        <w:t>r</w:t>
+      </w:r>
+      <w:r>
+        <w:rPr>
+          <w:rFonts w:asciiTheme="minorHAnsi" w:eastAsiaTheme="minorHAnsi" w:hAnsiTheme="minorHAnsi" w:cstheme="minorBidi"/>
+          <w:b/>
+          <w:bCs/>
+          <w:i/>
+          <w:iCs/>
+          <w:color w:val="auto"/>
+          <w:sz w:val="22"/>
+          <w:szCs w:val="22"/>
+        </w:rPr>
+        <w:t>aíz unitaria</w:t>
+      </w:r>
+      <w:r>
+        <w:rPr>
+          <w:rFonts w:asciiTheme="minorHAnsi" w:eastAsiaTheme="minorHAnsi" w:hAnsiTheme="minorHAnsi" w:cstheme="minorBidi"/>
+          <w:color w:val="auto"/>
+          <w:sz w:val="22"/>
+          <w:szCs w:val="22"/>
+        </w:rPr>
+        <w:t xml:space="preserve"> y la necesidad de aplicar una diferenciación regular (d=1). La FACP exhibe un único spike significativo en el </w:t>
+      </w:r>
+      <w:r>
+        <w:rPr>
+          <w:rFonts w:asciiTheme="minorHAnsi" w:eastAsiaTheme="minorHAnsi" w:hAnsiTheme="minorHAnsi" w:cstheme="minorBidi"/>
+          <w:color w:val="auto"/>
+          <w:sz w:val="22"/>
+          <w:szCs w:val="22"/>
+        </w:rPr>
+        <w:t>LAG</w:t>
+      </w:r>
+      <w:r>
+        <w:rPr>
+          <w:rFonts w:asciiTheme="minorHAnsi" w:eastAsiaTheme="minorHAnsi" w:hAnsiTheme="minorHAnsi" w:cstheme="minorBidi"/>
+          <w:color w:val="auto"/>
+          <w:sz w:val="22"/>
+          <w:szCs w:val="22"/>
+        </w:rPr>
+        <w:t xml:space="preserve"> 1 seguido de una caída inmediata a cero, lo que indica una estructura AR(1) subyacente.</w:t>
+      </w:r>
+    </w:p>
+    <w:p>
+      <w:pPr>
+        <w:pStyle w:val="Heading2"/>
+        <w:rPr>
+          <w:rFonts w:asciiTheme="minorHAnsi" w:eastAsiaTheme="minorHAnsi" w:hAnsiTheme="minorHAnsi" w:cstheme="minorBidi"/>
+          <w:color w:val="auto"/>
+          <w:sz w:val="22"/>
+          <w:szCs w:val="22"/>
+        </w:rPr>
+      </w:pPr>
+      <w:commentRangeStart w:id="1"/>
+      <w:r>
+        <w:rPr>
+          <w:rFonts w:asciiTheme="minorHAnsi" w:eastAsiaTheme="minorHAnsi" w:hAnsiTheme="minorHAnsi" w:cstheme="minorBidi"/>
+          <w:color w:val="auto"/>
+          <w:sz w:val="22"/>
+          <w:szCs w:val="22"/>
+          <w:highlight w:val="yellow"/>
+        </w:rPr>
+        <w:t>GRAFICO SERIE ORIGINAL</w:t>
+      </w:r>
+      <w:commentRangeEnd w:id="1"/>
+      <w:r>
+        <w:rPr>
+          <w:rStyle w:val="CommentReference"/>
+          <w:rFonts w:asciiTheme="minorHAnsi" w:eastAsiaTheme="minorHAnsi" w:hAnsiTheme="minorHAnsi" w:cstheme="minorBidi"/>
+          <w:color w:val="auto"/>
+          <w:highlight w:val="yellow"/>
+        </w:rPr>
+        <w:commentReference w:id="1"/>
+      </w:r>
+    </w:p>
+    <w:p>
+      <w:pPr>
+        <w:pStyle w:val="Heading2"/>
+        <w:jc w:val="both"/>
+        <w:rPr>
+          <w:rFonts w:asciiTheme="minorHAnsi" w:eastAsiaTheme="minorHAnsi" w:hAnsiTheme="minorHAnsi" w:cstheme="minorBidi"/>
+          <w:color w:val="auto"/>
+          <w:sz w:val="22"/>
+          <w:szCs w:val="22"/>
+        </w:rPr>
+      </w:pPr>
+      <w:r>
+        <w:rPr>
+          <w:rFonts w:asciiTheme="minorHAnsi" w:eastAsiaTheme="minorHAnsi" w:hAnsiTheme="minorHAnsi" w:cstheme="minorBidi"/>
+          <w:color w:val="auto"/>
+          <w:sz w:val="22"/>
+          <w:szCs w:val="22"/>
+        </w:rPr>
+        <w:t xml:space="preserve">Una vez que se aplica la primera diferencia, la FAC queda casi </w:t>
+      </w:r>
+      <w:r>
+        <w:rPr>
+          <w:rFonts w:asciiTheme="minorHAnsi" w:eastAsiaTheme="minorHAnsi" w:hAnsiTheme="minorHAnsi" w:cstheme="minorBidi"/>
+          <w:color w:val="auto"/>
+          <w:sz w:val="22"/>
+          <w:szCs w:val="22"/>
+        </w:rPr>
+        <w:t xml:space="preserve">por completo dentro de las bandas de confianza indicando que el componente de tendencia fue eliminado. No se observan picos claros en los rezagos 12 y 24, </w:t>
+      </w:r>
+      <w:r>
+        <w:rPr>
+          <w:rFonts w:asciiTheme="minorHAnsi" w:eastAsiaTheme="minorHAnsi" w:hAnsiTheme="minorHAnsi" w:cstheme="minorBidi"/>
+          <w:color w:val="auto"/>
+          <w:sz w:val="22"/>
+          <w:szCs w:val="22"/>
+        </w:rPr>
+        <w:t xml:space="preserve">lo que podría atribuirse al quiebre estructural generado por la pandemia de COVID, cuyos outliers </w:t>
+      </w:r>
+      <w:r>
+        <w:rPr>
+          <w:rFonts w:asciiTheme="minorHAnsi" w:eastAsiaTheme="minorHAnsi" w:hAnsiTheme="minorHAnsi" w:cstheme="minorBidi"/>
+          <w:color w:val="auto"/>
+          <w:sz w:val="22"/>
+          <w:szCs w:val="22"/>
+        </w:rPr>
+        <w:t xml:space="preserve">estarían “enmascarando” la señal estacional de la serie en los cambios. </w:t>
+      </w:r>
+    </w:p>
+    <w:p>
+      <w:r>
+        <w:rPr>
+          <w:highlight w:val="yellow"/>
+        </w:rPr>
+        <w:t>GRAFICO d=1</w:t>
+      </w:r>
+    </w:p>
+    <w:p>
+      <w:pPr>
+        <w:jc w:val="both"/>
+        <w:rPr>
+          <w:sz w:val="22"/>
+          <w:szCs w:val="22"/>
+        </w:rPr>
+      </w:pPr>
+      <w:r>
+        <w:rPr>
+          <w:sz w:val="22"/>
+          <w:szCs w:val="22"/>
+        </w:rPr>
+        <w:t xml:space="preserve">Sin embargo, </w:t>
+      </w:r>
+      <w:r>
+        <w:rPr>
+          <w:sz w:val="22"/>
+          <w:szCs w:val="22"/>
+        </w:rPr>
+        <w:t xml:space="preserve">debido a que la estacionalidad annual es muy evidente en la FAS original, se procede a aplicar una diferenciación estacional (D=1, s =12) que será luego confirmada </w:t>
+      </w:r>
+      <w:r>
+        <w:rPr>
+          <w:sz w:val="22"/>
+          <w:szCs w:val="22"/>
+        </w:rPr>
+        <w:t xml:space="preserve">luego en este trabajo con los tests de raíces unitarias. </w:t>
+      </w:r>
+    </w:p>
+    <w:p>
+      <w:pPr>
+        <w:jc w:val="both"/>
+        <w:rPr>
+          <w:sz w:val="22"/>
+          <w:szCs w:val="22"/>
+        </w:rPr>
+      </w:pPr>
+      <w:r>
+        <w:rPr>
+          <w:sz w:val="22"/>
+          <w:szCs w:val="22"/>
+        </w:rPr>
+        <w:t>Con ambas diferenciaciones aplicadas se puede leer la estructura ARIMA</w:t>
+      </w:r>
+      <w:r>
+        <w:rPr>
+          <w:sz w:val="22"/>
+          <w:szCs w:val="22"/>
+        </w:rPr>
+        <w:t>, con un pico negativo significativo en en LAG 1 de la FAC sugiriendo un compontente MA(1) o SMA(1)</w:t>
+      </w:r>
+      <w:r>
+        <w:rPr>
+          <w:sz w:val="22"/>
+          <w:szCs w:val="22"/>
+          <w:vertAlign w:val="subscript"/>
+        </w:rPr>
+        <w:t>12</w:t>
+      </w:r>
+      <w:r>
+        <w:rPr>
+          <w:sz w:val="22"/>
+          <w:szCs w:val="22"/>
+        </w:rPr>
+        <w:t xml:space="preserve">. Además, </w:t>
+      </w:r>
+      <w:r>
+        <w:rPr>
+          <w:sz w:val="22"/>
+          <w:szCs w:val="22"/>
+        </w:rPr>
+        <w:t xml:space="preserve">en la FACP </w:t>
+      </w:r>
+      <w:r>
+        <w:rPr>
+          <w:sz w:val="22"/>
+          <w:szCs w:val="22"/>
+        </w:rPr>
+        <w:t>se observa</w:t>
+      </w:r>
+      <w:r>
+        <w:rPr>
+          <w:sz w:val="22"/>
+          <w:szCs w:val="22"/>
+        </w:rPr>
+        <w:t>n</w:t>
+      </w:r>
+      <w:r>
+        <w:rPr>
+          <w:sz w:val="22"/>
+          <w:szCs w:val="22"/>
+        </w:rPr>
+        <w:t xml:space="preserve"> pico</w:t>
+      </w:r>
+      <w:r>
+        <w:rPr>
+          <w:sz w:val="22"/>
+          <w:szCs w:val="22"/>
+        </w:rPr>
+        <w:t>s</w:t>
+      </w:r>
+      <w:r>
+        <w:rPr>
+          <w:sz w:val="22"/>
+          <w:szCs w:val="22"/>
+        </w:rPr>
+        <w:t xml:space="preserve"> negativo</w:t>
+      </w:r>
+      <w:r>
+        <w:rPr>
+          <w:sz w:val="22"/>
+          <w:szCs w:val="22"/>
+        </w:rPr>
+        <w:t>s</w:t>
+      </w:r>
+      <w:r>
+        <w:rPr>
+          <w:sz w:val="22"/>
+          <w:szCs w:val="22"/>
+        </w:rPr>
+        <w:t xml:space="preserve"> en </w:t>
+      </w:r>
+      <w:r>
+        <w:rPr>
+          <w:sz w:val="22"/>
+          <w:szCs w:val="22"/>
+        </w:rPr>
+        <w:t>los</w:t>
+      </w:r>
+      <w:r>
+        <w:rPr>
+          <w:sz w:val="22"/>
+          <w:szCs w:val="22"/>
+        </w:rPr>
+        <w:t xml:space="preserve"> LAG 1 y</w:t>
+      </w:r>
+      <w:r>
+        <w:rPr>
+          <w:sz w:val="22"/>
+          <w:szCs w:val="22"/>
+        </w:rPr>
+        <w:t xml:space="preserve"> 12 sugirienco componententes AR(1) y SAR(1). </w:t>
+      </w:r>
+      <w:r>
+        <w:rPr>
+          <w:sz w:val="22"/>
+          <w:szCs w:val="22"/>
+        </w:rPr>
+        <w:t>Los valores significativos observados alrededor de los rezagos 20-25 se atribuyen a outliers amplificados por la doble diferenciación durante el período COVID, no a estructura ARIMA real.</w:t>
+      </w:r>
+    </w:p>
+    <w:p>
+      <w:pPr>
+        <w:jc w:val="both"/>
+        <w:rPr>
+          <w:sz w:val="22"/>
+          <w:szCs w:val="22"/>
+        </w:rPr>
+      </w:pPr>
+      <w:r>
+        <w:rPr>
+          <w:sz w:val="22"/>
+          <w:szCs w:val="22"/>
+          <w:highlight w:val="yellow"/>
+        </w:rPr>
+        <w:t>GRAFICOS D=1 s=12</w:t>
+      </w:r>
+    </w:p>
+    <w:p>
+      <w:pPr>
+        <w:pStyle w:val="Heading2"/>
+        <w:rPr>
+          <w:rFonts w:ascii="Century Gothic" w:hAnsi="Century Gothic"/>
+          <w:b/>
+          <w:bCs/>
+          <w:color w:val="152186"/>
+          <w:sz w:val="22"/>
+          <w:szCs w:val="22"/>
+        </w:rPr>
+      </w:pPr>
+      <w:r>
+        <w:rPr>
+          <w:rFonts w:ascii="Century Gothic" w:hAnsi="Century Gothic"/>
+          <w:b/>
+          <w:bCs/>
+          <w:color w:val="152186"/>
+          <w:sz w:val="22"/>
+          <w:szCs w:val="22"/>
+        </w:rPr>
+        <w:t xml:space="preserve">Análisis serie </w:t>
+      </w:r>
+      <w:r>
+        <w:rPr>
+          <w:rFonts w:ascii="Century Gothic" w:hAnsi="Century Gothic"/>
+          <w:b/>
+          <w:bCs/>
+          <w:color w:val="152186"/>
+          <w:sz w:val="22"/>
+          <w:szCs w:val="22"/>
+        </w:rPr>
+        <w:t>Peajes — vehículos mensuales</w:t>
+      </w:r>
+    </w:p>
+    <w:p>
+      <w:pPr>
+        <w:spacing w:line="276" w:lineRule="auto"/>
+        <w:jc w:val="both"/>
+        <w:rPr>
+          <w:sz w:val="22"/>
+          <w:szCs w:val="22"/>
+        </w:rPr>
+      </w:pPr>
+      <w:r>
+        <w:rPr>
+          <w:sz w:val="22"/>
+          <w:szCs w:val="22"/>
+        </w:rPr>
+        <w:t>La FAS muestra un comportamiento estable con baja variabilidad entre 2013 y 2019</w:t>
+      </w:r>
+      <w:r>
+        <w:rPr>
+          <w:sz w:val="22"/>
+          <w:szCs w:val="22"/>
+        </w:rPr>
+        <w:t xml:space="preserve"> para la serie de Peajes,</w:t>
+      </w:r>
+      <w:r>
+        <w:rPr>
+          <w:sz w:val="22"/>
+          <w:szCs w:val="22"/>
+        </w:rPr>
+        <w:t xml:space="preserve"> seguido de un colapso prácticamente total durante 2020 y una recuperación</w:t>
+      </w:r>
+      <w:r>
+        <w:rPr>
+          <w:sz w:val="22"/>
+          <w:szCs w:val="22"/>
+        </w:rPr>
+        <w:t xml:space="preserve"> </w:t>
+      </w:r>
+      <w:r>
+        <w:rPr>
+          <w:sz w:val="22"/>
+          <w:szCs w:val="22"/>
+        </w:rPr>
+        <w:t xml:space="preserve">volátil con niveles crecientes hacia 2025. El quiebre estructural producido por el COVID es más severo que en el </w:t>
+      </w:r>
+      <w:r>
+        <w:rPr>
+          <w:sz w:val="22"/>
+          <w:szCs w:val="22"/>
+        </w:rPr>
+        <w:t>S</w:t>
+      </w:r>
+      <w:r>
+        <w:rPr>
+          <w:sz w:val="22"/>
+          <w:szCs w:val="22"/>
+        </w:rPr>
+        <w:t>ubte, lo que tiene sentido dado que el transporte automotor fue más afectado por las restricciones de circulación.</w:t>
+      </w:r>
+    </w:p>
+    <w:p>
+      <w:pPr>
+        <w:spacing w:line="276" w:lineRule="auto"/>
+        <w:jc w:val="both"/>
+        <w:rPr>
+          <w:sz w:val="22"/>
+          <w:szCs w:val="22"/>
+        </w:rPr>
+      </w:pPr>
+      <w:r>
+        <w:rPr>
+          <w:sz w:val="22"/>
+          <w:szCs w:val="22"/>
+        </w:rPr>
+        <w:t>La FAC</w:t>
+      </w:r>
+      <w:r>
+        <w:rPr>
+          <w:sz w:val="22"/>
+          <w:szCs w:val="22"/>
+        </w:rPr>
+        <w:t xml:space="preserve"> </w:t>
+      </w:r>
+      <w:r>
+        <w:rPr>
+          <w:sz w:val="22"/>
+          <w:szCs w:val="22"/>
+        </w:rPr>
+        <w:t>exhibe el patrón más llamativo del conjunto</w:t>
+      </w:r>
+      <w:r>
+        <w:rPr>
+          <w:sz w:val="22"/>
+          <w:szCs w:val="22"/>
+        </w:rPr>
+        <w:t xml:space="preserve">, ya que </w:t>
+      </w:r>
+      <w:r>
+        <w:rPr>
+          <w:sz w:val="22"/>
+          <w:szCs w:val="22"/>
+        </w:rPr>
+        <w:t>comienza en ~0.7, decae rápidamente y luego oscila hacia valores negativos (llegando a -0.5 en los rezagos 20-30). Este comportamiento no corresponde a un proceso ARIMA estándar, sino que es la consecuencia directa del quiebre estructural: el colapso y posterior recuperación de la serie en niveles superiores a los previos genera autocorrelaciones de signo alternado. Esto indica que la variable dummy de COVID es indispensable</w:t>
+      </w:r>
+      <w:r>
+        <w:rPr>
+          <w:sz w:val="22"/>
+          <w:szCs w:val="22"/>
+        </w:rPr>
+        <w:t xml:space="preserve"> </w:t>
+      </w:r>
+      <w:r>
+        <w:rPr>
+          <w:sz w:val="22"/>
+          <w:szCs w:val="22"/>
+        </w:rPr>
+        <w:t>en el modelo para aislar el efecto pandémico de la dinámica subyacente de la serie.</w:t>
+      </w:r>
+    </w:p>
+    <w:p>
+      <w:pPr>
+        <w:spacing w:line="276" w:lineRule="auto"/>
+        <w:jc w:val="both"/>
+        <w:rPr>
+          <w:sz w:val="22"/>
+          <w:szCs w:val="22"/>
+        </w:rPr>
+      </w:pPr>
+      <w:r>
+        <w:rPr>
+          <w:sz w:val="22"/>
+          <w:szCs w:val="22"/>
+        </w:rPr>
+        <w:t xml:space="preserve">Finalmente, la </w:t>
+      </w:r>
+      <w:r>
+        <w:rPr>
+          <w:sz w:val="22"/>
+          <w:szCs w:val="22"/>
+        </w:rPr>
+        <w:t xml:space="preserve">FACP presenta un </w:t>
+      </w:r>
+      <w:r>
+        <w:rPr>
+          <w:sz w:val="22"/>
+          <w:szCs w:val="22"/>
+        </w:rPr>
+        <w:t>pico</w:t>
+      </w:r>
+      <w:r>
+        <w:rPr>
+          <w:sz w:val="22"/>
+          <w:szCs w:val="22"/>
+        </w:rPr>
+        <w:t xml:space="preserve"> en el lag 1, algunos rezagos significativos adicionales y luego decae a cero, orientando hacia un componente AR de orden bajo una vez corregido el quiebre estructural.</w:t>
+      </w:r>
+    </w:p>
+    <w:p>
+      <w:pPr>
+        <w:pStyle w:val="Heading2"/>
+        <w:rPr>
+          <w:rFonts w:ascii="Century Gothic" w:hAnsi="Century Gothic"/>
+          <w:b/>
+          <w:bCs/>
+          <w:color w:val="152186"/>
+          <w:sz w:val="22"/>
+          <w:szCs w:val="22"/>
+        </w:rPr>
+      </w:pPr>
+      <w:r>
+        <w:rPr>
+          <w:rFonts w:ascii="Century Gothic" w:hAnsi="Century Gothic"/>
+          <w:b/>
+          <w:bCs/>
+          <w:color w:val="152186"/>
+          <w:sz w:val="22"/>
+          <w:szCs w:val="22"/>
+        </w:rPr>
+        <w:lastRenderedPageBreak/>
+        <w:t>Análisis serie</w:t>
+      </w:r>
+      <w:r>
+        <w:rPr>
+          <w:rFonts w:ascii="Century Gothic" w:hAnsi="Century Gothic"/>
+          <w:b/>
+          <w:bCs/>
+          <w:color w:val="152186"/>
+          <w:sz w:val="22"/>
+          <w:szCs w:val="22"/>
+        </w:rPr>
+        <w:t xml:space="preserve"> Precipitaciones — mm mensuales</w:t>
+      </w:r>
+    </w:p>
+    <w:p>
+      <w:pPr>
+        <w:spacing w:line="276" w:lineRule="auto"/>
+        <w:jc w:val="both"/>
+        <w:rPr>
+          <w:sz w:val="22"/>
+          <w:szCs w:val="22"/>
+        </w:rPr>
+      </w:pPr>
+      <w:r>
+        <w:rPr>
+          <w:sz w:val="22"/>
+          <w:szCs w:val="22"/>
+        </w:rPr>
+        <w:t>En este caso, l</w:t>
+      </w:r>
+      <w:r>
+        <w:rPr>
+          <w:sz w:val="22"/>
+          <w:szCs w:val="22"/>
+        </w:rPr>
+        <w:t xml:space="preserve">a FAS no presenta tendencia ni quiebre estructural visible; la serie fluctúa alrededor de una media estable con varianza aproximadamente constante a lo largo del período, lo que sugiere que es </w:t>
+      </w:r>
+      <w:r>
+        <w:rPr>
+          <w:b/>
+          <w:bCs/>
+          <w:i/>
+          <w:iCs/>
+          <w:sz w:val="22"/>
+          <w:szCs w:val="22"/>
+        </w:rPr>
+        <w:t>estacionaria</w:t>
+      </w:r>
+      <w:r>
+        <w:rPr>
+          <w:sz w:val="22"/>
+          <w:szCs w:val="22"/>
+        </w:rPr>
+        <w:t xml:space="preserve"> o requiere, a lo sumo, diferenciación estacional.</w:t>
+      </w:r>
+    </w:p>
+    <w:p>
+      <w:pPr>
+        <w:spacing w:line="276" w:lineRule="auto"/>
+        <w:jc w:val="both"/>
+        <w:rPr>
+          <w:sz w:val="22"/>
+          <w:szCs w:val="22"/>
+        </w:rPr>
+      </w:pPr>
+      <w:r>
+        <w:rPr>
+          <w:sz w:val="22"/>
+          <w:szCs w:val="22"/>
+        </w:rPr>
+        <w:t>Luego, l</w:t>
+      </w:r>
+      <w:r>
+        <w:rPr>
+          <w:sz w:val="22"/>
+          <w:szCs w:val="22"/>
+        </w:rPr>
+        <w:t xml:space="preserve">a FAC muestra casi todas las barras dentro de las bandas de confianza. La ausencia de autocorrelación significativa indica que los valores de precipitación mensual son estadísticamente independientes de los meses anteriores. </w:t>
+      </w:r>
+      <w:r>
+        <w:rPr>
+          <w:sz w:val="22"/>
+          <w:szCs w:val="22"/>
+        </w:rPr>
+        <w:t>De este modo,</w:t>
+      </w:r>
+      <w:r>
+        <w:rPr>
+          <w:sz w:val="22"/>
+          <w:szCs w:val="22"/>
+        </w:rPr>
+        <w:t xml:space="preserve"> un mes lluvioso no </w:t>
+      </w:r>
+      <w:r>
+        <w:rPr>
+          <w:sz w:val="22"/>
+          <w:szCs w:val="22"/>
+        </w:rPr>
+        <w:t>predice</w:t>
+      </w:r>
+      <w:r>
+        <w:rPr>
+          <w:sz w:val="22"/>
+          <w:szCs w:val="22"/>
+        </w:rPr>
+        <w:t xml:space="preserve"> el siguiente.</w:t>
+      </w:r>
+    </w:p>
+    <w:p>
+      <w:pPr>
+        <w:spacing w:line="276" w:lineRule="auto"/>
+        <w:jc w:val="both"/>
+        <w:rPr>
+          <w:sz w:val="22"/>
+          <w:szCs w:val="22"/>
+        </w:rPr>
+      </w:pPr>
+      <w:r>
+        <w:rPr>
+          <w:sz w:val="22"/>
+          <w:szCs w:val="22"/>
+        </w:rPr>
+        <w:t>Por último, l</w:t>
+      </w:r>
+      <w:r>
+        <w:rPr>
+          <w:sz w:val="22"/>
+          <w:szCs w:val="22"/>
+        </w:rPr>
+        <w:t>a FACP confirma el mismo diagnóstico</w:t>
+      </w:r>
+      <w:r>
+        <w:rPr>
+          <w:sz w:val="22"/>
+          <w:szCs w:val="22"/>
+        </w:rPr>
+        <w:t xml:space="preserve"> de </w:t>
+      </w:r>
+      <w:r>
+        <w:rPr>
+          <w:sz w:val="22"/>
+          <w:szCs w:val="22"/>
+        </w:rPr>
+        <w:t xml:space="preserve">caída inmediata a cero sin rezagos significativos. La serie se comporta como un </w:t>
+      </w:r>
+      <w:r>
+        <w:rPr>
+          <w:b/>
+          <w:bCs/>
+          <w:i/>
+          <w:iCs/>
+          <w:sz w:val="22"/>
+          <w:szCs w:val="22"/>
+        </w:rPr>
+        <w:t>proceso de ruido blanco</w:t>
+      </w:r>
+      <w:r>
+        <w:rPr>
+          <w:sz w:val="22"/>
+          <w:szCs w:val="22"/>
+        </w:rPr>
+        <w:t xml:space="preserve">, posiblemente con una leve componente estacional asociada al ciclo de lluvias </w:t>
+      </w:r>
+      <w:r>
+        <w:rPr>
+          <w:sz w:val="22"/>
+          <w:szCs w:val="22"/>
+        </w:rPr>
+        <w:t xml:space="preserve">de la Ciudad de Buenos Aires con veranos más lluviosos, </w:t>
+      </w:r>
+      <w:r>
+        <w:rPr>
+          <w:sz w:val="22"/>
+          <w:szCs w:val="22"/>
+        </w:rPr>
+        <w:t>aunque no estadísticamente dominante en estos gráficos.</w:t>
+      </w:r>
+    </w:p>
+    <w:p>
+      <w:pPr>
+        <w:pStyle w:val="Heading2"/>
+        <w:rPr>
+          <w:rFonts w:ascii="Century Gothic" w:hAnsi="Century Gothic"/>
+          <w:b/>
+          <w:bCs/>
+          <w:color w:val="152186"/>
+          <w:sz w:val="22"/>
+          <w:szCs w:val="22"/>
+        </w:rPr>
+      </w:pPr>
+      <w:r>
+        <w:rPr>
+          <w:rFonts w:ascii="Century Gothic" w:hAnsi="Century Gothic"/>
+          <w:b/>
+          <w:bCs/>
+          <w:color w:val="152186"/>
+          <w:sz w:val="22"/>
+          <w:szCs w:val="22"/>
+        </w:rPr>
+        <w:t>Implicancias para el modelado</w:t>
+      </w:r>
+    </w:p>
+    <w:p>
+      <w:pPr>
+        <w:spacing w:line="276" w:lineRule="auto"/>
+        <w:jc w:val="both"/>
+        <w:rPr>
+          <w:sz w:val="22"/>
+          <w:szCs w:val="22"/>
+        </w:rPr>
+      </w:pPr>
+      <w:r>
+        <w:rPr>
+          <w:sz w:val="22"/>
+          <w:szCs w:val="22"/>
+        </w:rPr>
+        <w:t xml:space="preserve">Al realizar un análisis conjunto de las tres funciones, se desprenden la siguientes conclusiones preliminares antes de avanzar con el análisis: </w:t>
+      </w:r>
+    </w:p>
+    <w:p>
+      <w:pPr>
+        <w:pStyle w:val="ListParagraph"/>
+        <w:numPr>
+          <w:ilvl w:val="0"/>
+          <w:numId w:val="11"/>
+        </w:numPr>
+        <w:spacing w:line="276" w:lineRule="auto"/>
+        <w:jc w:val="both"/>
+        <w:rPr>
+          <w:sz w:val="22"/>
+          <w:szCs w:val="22"/>
+        </w:rPr>
+      </w:pPr>
+      <w:r>
+        <w:rPr>
+          <w:sz w:val="22"/>
+          <w:szCs w:val="22"/>
+        </w:rPr>
+        <w:t xml:space="preserve">En primer lugar, las series de Subte y Peajes son series no estacionarias que requieren de, al menos, una diferenciación regular (d=1) y presumiblemente una diferenciacion estacional (D=1, s=12) para poder lograr estacionariedad. Esto será probado formalmente más adelante con los test de raíces unitarias. </w:t>
+      </w:r>
+    </w:p>
+    <w:p>
+      <w:pPr>
+        <w:pStyle w:val="ListParagraph"/>
+        <w:numPr>
+          <w:ilvl w:val="0"/>
+          <w:numId w:val="11"/>
+        </w:numPr>
+        <w:spacing w:line="276" w:lineRule="auto"/>
+        <w:jc w:val="both"/>
+        <w:rPr>
+          <w:sz w:val="22"/>
+          <w:szCs w:val="22"/>
+        </w:rPr>
+      </w:pPr>
+      <w:r>
+        <w:rPr>
+          <w:sz w:val="22"/>
+          <w:szCs w:val="22"/>
+        </w:rPr>
+        <w:t xml:space="preserve">En segundo lugar, el </w:t>
+      </w:r>
+      <w:r>
+        <w:rPr>
+          <w:sz w:val="22"/>
+          <w:szCs w:val="22"/>
+        </w:rPr>
+        <w:t xml:space="preserve">uso de la variable dummy COVID es crítica para la serie de Peajes, cuya FAC se encuentra completamente distorsionada por el quiebre estructural de la pandemia. De no aplicarse esta correción, </w:t>
+      </w:r>
+      <w:r>
+        <w:rPr>
+          <w:sz w:val="22"/>
+          <w:szCs w:val="22"/>
+        </w:rPr>
+        <w:t xml:space="preserve">no hay modelo ARIMA estándar que pudiese capturar la dinámica subyacente. </w:t>
+      </w:r>
+    </w:p>
+    <w:p>
+      <w:pPr>
+        <w:pStyle w:val="ListParagraph"/>
+        <w:numPr>
+          <w:ilvl w:val="0"/>
+          <w:numId w:val="11"/>
+        </w:numPr>
+        <w:spacing w:line="276" w:lineRule="auto"/>
+        <w:jc w:val="both"/>
+        <w:rPr>
+          <w:sz w:val="22"/>
+          <w:szCs w:val="22"/>
+        </w:rPr>
+      </w:pPr>
+      <w:r>
+        <w:rPr>
+          <w:sz w:val="22"/>
+          <w:szCs w:val="22"/>
+        </w:rPr>
+        <w:t xml:space="preserve">Por último, las Precipitaciones </w:t>
+      </w:r>
+      <w:r>
+        <w:rPr>
+          <w:sz w:val="22"/>
+          <w:szCs w:val="22"/>
+        </w:rPr>
+        <w:t>son estacionarias y se utilizarán directamente como variable exógena en el modelo SARIMA-X sin necesidad de transformación</w:t>
+      </w:r>
+      <w:r>
+        <w:rPr>
+          <w:sz w:val="22"/>
+          <w:szCs w:val="22"/>
+        </w:rPr>
+        <w:t xml:space="preserve">. </w:t>
+      </w:r>
       <w:r>
         <w:rPr>
           <w:sz w:val="22"/>
@@ -858,7 +2157,33 @@
         <w:shd w:val="clear" w:color="auto" w:fill="FFFFFF"/>
         <w:spacing w:before="120" w:after="0"/>
         <w:rPr>
-          <w:lang w:val="en-US"/>
+          <w:rFonts w:ascii="Roboto" w:hAnsi="Roboto"/>
+          <w:color w:val="121212"/>
+          <w:sz w:val="34"/>
+          <w:szCs w:val="34"/>
+        </w:rPr>
+      </w:pPr>
+      <w:r>
+        <w:rPr>
+          <w:rFonts w:ascii="Roboto" w:hAnsi="Roboto"/>
+          <w:color w:val="121212"/>
+          <w:sz w:val="34"/>
+          <w:szCs w:val="34"/>
+        </w:rPr>
+        <w:lastRenderedPageBreak/>
+        <w:t xml:space="preserve">REFRENCIAS CLAUDE Y DEMAS </w:t>
+      </w:r>
+    </w:p>
+    <w:p>
+      <w:pPr>
+        <w:pStyle w:val="Heading2"/>
+        <w:shd w:val="clear" w:color="auto" w:fill="FFFFFF"/>
+        <w:spacing w:before="120" w:after="0"/>
+        <w:rPr>
+          <w:rFonts w:ascii="Roboto" w:hAnsi="Roboto"/>
+          <w:color w:val="121212"/>
+          <w:sz w:val="34"/>
+          <w:szCs w:val="34"/>
         </w:rPr>
       </w:pPr>
       <w:r>
@@ -917,7 +2242,7 @@
           <w:szCs w:val="22"/>
         </w:rPr>
       </w:pPr>
-      <w:hyperlink r:id="rId8" w:history="1">
+      <w:hyperlink r:id="rId12" w:history="1">
         <w:r>
           <w:rPr>
             <w:rStyle w:val="Hyperlink"/>
@@ -1065,7 +2390,7 @@
           <w:szCs w:val="22"/>
         </w:rPr>
       </w:pPr>
-      <w:hyperlink r:id="rId9" w:history="1">
+      <w:hyperlink r:id="rId13" w:history="1">
         <w:r>
           <w:rPr>
             <w:rStyle w:val="Hyperlink"/>
@@ -1219,7 +2544,7 @@
           <w:szCs w:val="22"/>
         </w:rPr>
       </w:pPr>
-      <w:hyperlink r:id="rId10" w:history="1">
+      <w:hyperlink r:id="rId14" w:history="1">
         <w:r>
           <w:rPr>
             <w:rStyle w:val="Hyperlink"/>
@@ -1599,6 +2924,7 @@
           <w:sz w:val="21"/>
           <w:szCs w:val="21"/>
         </w:rPr>
+        <w:lastRenderedPageBreak/>
         <w:t>H6 — Precipitaciones: La serie de lluvias mensuales es estacionaria en media (sin tendencia de largo plazo significativa) pero con patrón estacional propio del clima pampeano (más lluvias en otoño/primavera).</w:t>
       </w:r>
     </w:p>
@@ -2173,8 +3499,13 @@
         <w:rPr>
           <w:noProof/>
         </w:rPr>
+      </w:r>
+      <w:r>
+        <w:rPr>
+          <w:noProof/>
+        </w:rPr>
         <w:pict w14:anchorId="7846A59A">
-          <v:rect id="_x0000_i1025" style="width:468pt;height:.05pt" o:hralign="center" o:hrstd="t" o:hr="t" fillcolor="#a0a0a0" stroked="f"/>
+          <v:rect id="_x0000_i1025" alt="" style="width:468pt;height:.05pt;mso-width-percent:0;mso-height-percent:0;mso-width-percent:0;mso-height-percent:0" o:hralign="center" o:hrstd="t" o:hr="t" fillcolor="#a0a0a0" stroked="f"/>
         </w:pict>
       </w:r>
     </w:p>
@@ -2417,6 +3748,7 @@
           <w:sz w:val="26"/>
           <w:szCs w:val="26"/>
         </w:rPr>
+        <w:lastRenderedPageBreak/>
         <w:t>v. Marco Teórico</w:t>
       </w:r>
     </w:p>
@@ -3239,6 +4571,7 @@
           <w:sz w:val="26"/>
           <w:szCs w:val="26"/>
         </w:rPr>
+        <w:lastRenderedPageBreak/>
         <w:t>viii. Referencias</w:t>
       </w:r>
     </w:p>
@@ -3365,8 +4698,13 @@
         <w:rPr>
           <w:noProof/>
         </w:rPr>
+      </w:r>
+      <w:r>
+        <w:rPr>
+          <w:noProof/>
+        </w:rPr>
         <w:pict w14:anchorId="494BEBD2">
-          <v:rect id="_x0000_i1026" style="width:468pt;height:.05pt" o:hralign="center" o:hrstd="t" o:hr="t" fillcolor="#a0a0a0" stroked="f"/>
+          <v:rect id="_x0000_i1026" alt="" style="width:468pt;height:.05pt;mso-width-percent:0;mso-height-percent:0;mso-width-percent:0;mso-height-percent:0" o:hralign="center" o:hrstd="t" o:hr="t" fillcolor="#a0a0a0" stroked="f"/>
         </w:pict>
       </w:r>
     </w:p>
@@ -3868,8 +5206,13 @@
         <w:rPr>
           <w:noProof/>
         </w:rPr>
+      </w:r>
+      <w:r>
+        <w:rPr>
+          <w:noProof/>
+        </w:rPr>
         <w:pict w14:anchorId="00A2C045">
-          <v:rect id="_x0000_i1027" style="width:468pt;height:.05pt" o:hralign="center" o:hrstd="t" o:hr="t" fillcolor="#a0a0a0" stroked="f"/>
+          <v:rect id="_x0000_i1027" alt="" style="width:468pt;height:.05pt;mso-width-percent:0;mso-height-percent:0;mso-width-percent:0;mso-height-percent:0" o:hralign="center" o:hrstd="t" o:hr="t" fillcolor="#a0a0a0" stroked="f"/>
         </w:pict>
       </w:r>
     </w:p>
@@ -4041,6 +5384,7 @@
           <w:sz w:val="21"/>
           <w:szCs w:val="21"/>
         </w:rPr>
+        <w:lastRenderedPageBreak/>
         <w:t>Expansión de la red de subte: Las líneas H y E se fueron expandiendo en el período. Podrían mencionarlo como limitación (la serie no es homogénea en estructura).</w:t>
       </w:r>
     </w:p>
@@ -4065,8 +5409,13 @@
         <w:rPr>
           <w:noProof/>
         </w:rPr>
+      </w:r>
+      <w:r>
+        <w:rPr>
+          <w:noProof/>
+        </w:rPr>
         <w:pict w14:anchorId="7EB6B688">
-          <v:rect id="_x0000_i1028" style="width:468pt;height:.05pt" o:hralign="center" o:hrstd="t" o:hr="t" fillcolor="#a0a0a0" stroked="f"/>
+          <v:rect id="_x0000_i1028" alt="" style="width:468pt;height:.05pt;mso-width-percent:0;mso-height-percent:0;mso-width-percent:0;mso-height-percent:0" o:hralign="center" o:hrstd="t" o:hr="t" fillcolor="#a0a0a0" stroked="f"/>
         </w:pict>
       </w:r>
     </w:p>
@@ -4098,8 +5447,8 @@
         <w:tblLook w:val="04A0" w:firstRow="1" w:lastRow="0" w:firstColumn="1" w:lastColumn="0" w:noHBand="0" w:noVBand="1"/>
       </w:tblPr>
       <w:tblGrid>
-        <w:gridCol w:w="1216"/>
-        <w:gridCol w:w="6398"/>
+        <w:gridCol w:w="1176"/>
+        <w:gridCol w:w="6347"/>
       </w:tblGrid>
       <w:tr>
         <w:trPr>
@@ -4371,8 +5720,13 @@
         <w:rPr>
           <w:noProof/>
         </w:rPr>
+      </w:r>
+      <w:r>
+        <w:rPr>
+          <w:noProof/>
+        </w:rPr>
         <w:pict w14:anchorId="42858AB3">
-          <v:rect id="_x0000_i1029" style="width:468pt;height:.05pt" o:hralign="center" o:hrstd="t" o:hr="t" fillcolor="#a0a0a0" stroked="f"/>
+          <v:rect id="_x0000_i1029" alt="" style="width:468pt;height:.05pt;mso-width-percent:0;mso-height-percent:0;mso-width-percent:0;mso-height-percent:0" o:hralign="center" o:hrstd="t" o:hr="t" fillcolor="#a0a0a0" stroked="f"/>
         </w:pict>
       </w:r>
     </w:p>
@@ -4395,6 +5749,21 @@
     <w:p/>
     <w:p>
       <w:pPr>
+        <w:rPr>
+          <w:sz w:val="22"/>
+          <w:szCs w:val="22"/>
+        </w:rPr>
+      </w:pPr>
+      <w:r>
+        <w:rPr>
+          <w:sz w:val="22"/>
+          <w:szCs w:val="22"/>
+        </w:rPr>
+        <w:br w:type="page"/>
+      </w:r>
+    </w:p>
+    <w:p>
+      <w:pPr>
         <w:spacing w:line="276" w:lineRule="auto"/>
         <w:jc w:val="both"/>
         <w:rPr>
@@ -4404,8 +5773,8 @@
       </w:pPr>
     </w:p>
     <w:sectPr>
-      <w:footerReference w:type="default" r:id="rId11"/>
-      <w:footerReference w:type="first" r:id="rId12"/>
+      <w:footerReference w:type="default" r:id="rId15"/>
+      <w:footerReference w:type="first" r:id="rId16"/>
       <w:pgSz w:w="12240" w:h="15840"/>
       <w:pgMar w:top="1440" w:right="1440" w:bottom="1440" w:left="1440" w:header="708" w:footer="708" w:gutter="0"/>
       <w:pgNumType w:start="0"/>
@@ -4415,6 +5784,67 @@
     </w:sectPr>
   </w:body>
 </w:document>
+</file>
+
+<file path=word/comments.xml><?xml version="1.0" encoding="utf-8"?>
+<w:comments xmlns:wpc="http://schemas.microsoft.com/office/word/2010/wordprocessingCanvas" xmlns:cx="http://schemas.microsoft.com/office/drawing/2014/chartex" xmlns:cx1="http://schemas.microsoft.com/office/drawing/2015/9/8/chartex" xmlns:cx2="http://schemas.microsoft.com/office/drawing/2015/10/21/chartex" xmlns:cx3="http://schemas.microsoft.com/office/drawing/2016/5/9/chartex" xmlns:cx4="http://schemas.microsoft.com/office/drawing/2016/5/10/chartex" xmlns:cx5="http://schemas.microsoft.com/office/drawing/2016/5/11/chartex" xmlns:cx6="http://schemas.microsoft.com/office/drawing/2016/5/12/chartex" xmlns:cx7="http://schemas.microsoft.com/office/drawing/2016/5/13/chartex" xmlns:cx8="http://schemas.microsoft.com/office/drawing/2016/5/14/chartex" xmlns:mc="http://schemas.openxmlformats.org/markup-compatibility/2006" xmlns:aink="http://schemas.microsoft.com/office/drawing/2016/ink" xmlns:am3d="http://schemas.microsoft.com/office/drawing/2017/model3d" xmlns:o="urn:schemas-microsoft-com:office:office" xmlns:oel="http://schemas.microsoft.com/office/2019/extlst" xmlns:r="http://schemas.openxmlformats.org/officeDocument/2006/relationships" xmlns:m="http://schemas.openxmlformats.org/officeDocument/2006/math" xmlns:v="urn:schemas-microsoft-com:vml" xmlns:wp14="http://schemas.microsoft.com/office/word/2010/wordprocessingDrawing" xmlns:wp="http://schemas.openxmlformats.org/drawingml/2006/wordprocessingDrawing" xmlns:w10="urn:schemas-microsoft-com:office:word" xmlns:w="http://schemas.openxmlformats.org/wordprocessingml/2006/main" xmlns:w14="http://schemas.microsoft.com/office/word/2010/wordml" xmlns:w15="http://schemas.microsoft.com/office/word/2012/wordml" xmlns:w16cex="http://schemas.microsoft.com/office/word/2018/wordml/cex" xmlns:w16cid="http://schemas.microsoft.com/office/word/2016/wordml/cid" xmlns:w16="http://schemas.microsoft.com/office/word/2018/wordml" xmlns:w16du="http://schemas.microsoft.com/office/word/2023/wordml/word16du" xmlns:w16sdtdh="http://schemas.microsoft.com/office/word/2020/wordml/sdtdatahash" xmlns:w16sdtfl="http://schemas.microsoft.com/office/word/2024/wordml/sdtformatlock" xmlns:w16se="http://schemas.microsoft.com/office/word/2015/wordml/symex" xmlns:wpg="http://schemas.microsoft.com/office/word/2010/wordprocessingGroup" xmlns:wpi="http://schemas.microsoft.com/office/word/2010/wordprocessingInk" xmlns:wne="http://schemas.microsoft.com/office/word/2006/wordml" xmlns:wps="http://schemas.microsoft.com/office/word/2010/wordprocessingShape" mc:Ignorable="w14 w15 w16se w16cid w16 w16cex w16sdtdh w16sdtfl w16du wp14">
+  <w:comment w:id="0" w:author="Giuliana Alvaro" w:date="2026-04-14T22:24:00Z" w:initials="GA">
+    <w:p>
+      <w:r>
+        <w:rPr>
+          <w:rStyle w:val="CommentReference"/>
+        </w:rPr>
+        <w:annotationRef/>
+      </w:r>
+      <w:r>
+        <w:rPr>
+          <w:sz w:val="20"/>
+          <w:szCs w:val="20"/>
+        </w:rPr>
+        <w:t>Esto es teoría. Actualizar con alguna fuente de libro</w:t>
+      </w:r>
+    </w:p>
+  </w:comment>
+  <w:comment w:id="1" w:author="Giuliana Alvaro" w:date="2026-04-14T22:18:00Z" w:initials="GA">
+    <w:p>
+      <w:r>
+        <w:rPr>
+          <w:rStyle w:val="CommentReference"/>
+        </w:rPr>
+        <w:annotationRef/>
+      </w:r>
+      <w:r>
+        <w:rPr>
+          <w:sz w:val="20"/>
+          <w:szCs w:val="20"/>
+        </w:rPr>
+        <w:t xml:space="preserve">Agregar grafico </w:t>
+      </w:r>
+    </w:p>
+    <w:p/>
+  </w:comment>
+</w:comments>
+</file>
+
+<file path=word/commentsExtended.xml><?xml version="1.0" encoding="utf-8"?>
+<w15:commentsEx xmlns:wpc="http://schemas.microsoft.com/office/word/2010/wordprocessingCanvas" xmlns:cx="http://schemas.microsoft.com/office/drawing/2014/chartex" xmlns:cx1="http://schemas.microsoft.com/office/drawing/2015/9/8/chartex" xmlns:cx2="http://schemas.microsoft.com/office/drawing/2015/10/21/chartex" xmlns:cx3="http://schemas.microsoft.com/office/drawing/2016/5/9/chartex" xmlns:cx4="http://schemas.microsoft.com/office/drawing/2016/5/10/chartex" xmlns:cx5="http://schemas.microsoft.com/office/drawing/2016/5/11/chartex" xmlns:cx6="http://schemas.microsoft.com/office/drawing/2016/5/12/chartex" xmlns:cx7="http://schemas.microsoft.com/office/drawing/2016/5/13/chartex" xmlns:cx8="http://schemas.microsoft.com/office/drawing/2016/5/14/chartex" xmlns:mc="http://schemas.openxmlformats.org/markup-compatibility/2006" xmlns:aink="http://schemas.microsoft.com/office/drawing/2016/ink" xmlns:am3d="http://schemas.microsoft.com/office/drawing/2017/model3d" xmlns:o="urn:schemas-microsoft-com:office:office" xmlns:oel="http://schemas.microsoft.com/office/2019/extlst" xmlns:r="http://schemas.openxmlformats.org/officeDocument/2006/relationships" xmlns:m="http://schemas.openxmlformats.org/officeDocument/2006/math" xmlns:v="urn:schemas-microsoft-com:vml" xmlns:wp14="http://schemas.microsoft.com/office/word/2010/wordprocessingDrawing" xmlns:wp="http://schemas.openxmlformats.org/drawingml/2006/wordprocessingDrawing" xmlns:w10="urn:schemas-microsoft-com:office:word" xmlns:w="http://schemas.openxmlformats.org/wordprocessingml/2006/main" xmlns:w14="http://schemas.microsoft.com/office/word/2010/wordml" xmlns:w15="http://schemas.microsoft.com/office/word/2012/wordml" xmlns:w16cex="http://schemas.microsoft.com/office/word/2018/wordml/cex" xmlns:w16cid="http://schemas.microsoft.com/office/word/2016/wordml/cid" xmlns:w16="http://schemas.microsoft.com/office/word/2018/wordml" xmlns:w16du="http://schemas.microsoft.com/office/word/2023/wordml/word16du" xmlns:w16sdtdh="http://schemas.microsoft.com/office/word/2020/wordml/sdtdatahash" xmlns:w16sdtfl="http://schemas.microsoft.com/office/word/2024/wordml/sdtformatlock" xmlns:w16se="http://schemas.microsoft.com/office/word/2015/wordml/symex" xmlns:wpg="http://schemas.microsoft.com/office/word/2010/wordprocessingGroup" xmlns:wpi="http://schemas.microsoft.com/office/word/2010/wordprocessingInk" xmlns:wne="http://schemas.microsoft.com/office/word/2006/wordml" xmlns:wps="http://schemas.microsoft.com/office/word/2010/wordprocessingShape" mc:Ignorable="w14 w15 w16se w16cid w16 w16cex w16sdtdh w16sdtfl w16du wp14">
+  <w15:commentEx w15:paraId="3AC99979" w15:done="0"/>
+  <w15:commentEx w15:paraId="63A57F59" w15:done="0"/>
+</w15:commentsEx>
+</file>
+
+<file path=word/commentsExtensible.xml><?xml version="1.0" encoding="utf-8"?>
+<w16cex:commentsExtensible xmlns:wpc="http://schemas.microsoft.com/office/word/2010/wordprocessingCanvas" xmlns:cx="http://schemas.microsoft.com/office/drawing/2014/chartex" xmlns:cx1="http://schemas.microsoft.com/office/drawing/2015/9/8/chartex" xmlns:cx2="http://schemas.microsoft.com/office/drawing/2015/10/21/chartex" xmlns:cx3="http://schemas.microsoft.com/office/drawing/2016/5/9/chartex" xmlns:cx4="http://schemas.microsoft.com/office/drawing/2016/5/10/chartex" xmlns:cx5="http://schemas.microsoft.com/office/drawing/2016/5/11/chartex" xmlns:cx6="http://schemas.microsoft.com/office/drawing/2016/5/12/chartex" xmlns:cx7="http://schemas.microsoft.com/office/drawing/2016/5/13/chartex" xmlns:cx8="http://schemas.microsoft.com/office/drawing/2016/5/14/chartex" xmlns:cr="http://schemas.microsoft.com/office/comments/2020/reactions" xmlns:mc="http://schemas.openxmlformats.org/markup-compatibility/2006" xmlns:aink="http://schemas.microsoft.com/office/drawing/2016/ink" xmlns:am3d="http://schemas.microsoft.com/office/drawing/2017/model3d" xmlns:o="urn:schemas-microsoft-com:office:office" xmlns:oel="http://schemas.microsoft.com/office/2019/extlst" xmlns:r="http://schemas.openxmlformats.org/officeDocument/2006/relationships" xmlns:m="http://schemas.openxmlformats.org/officeDocument/2006/math" xmlns:v="urn:schemas-microsoft-com:vml" xmlns:wp14="http://schemas.microsoft.com/office/word/2010/wordprocessingDrawing" xmlns:wp="http://schemas.openxmlformats.org/drawingml/2006/wordprocessingDrawing" xmlns:w10="urn:schemas-microsoft-com:office:word" xmlns:w="http://schemas.openxmlformats.org/wordprocessingml/2006/main" xmlns:w14="http://schemas.microsoft.com/office/word/2010/wordml" xmlns:w15="http://schemas.microsoft.com/office/word/2012/wordml" xmlns:w16cex="http://schemas.microsoft.com/office/word/2018/wordml/cex" xmlns:w16cid="http://schemas.microsoft.com/office/word/2016/wordml/cid" xmlns:w16="http://schemas.microsoft.com/office/word/2018/wordml" xmlns:w16du="http://schemas.microsoft.com/office/word/2023/wordml/word16du" xmlns:w16sdtdh="http://schemas.microsoft.com/office/word/2020/wordml/sdtdatahash" xmlns:w16sdtfl="http://schemas.microsoft.com/office/word/2024/wordml/sdtformatlock" xmlns:w16se="http://schemas.microsoft.com/office/word/2015/wordml/symex" xmlns:wpg="http://schemas.microsoft.com/office/word/2010/wordprocessingGroup" xmlns:wpi="http://schemas.microsoft.com/office/word/2010/wordprocessingInk" xmlns:wne="http://schemas.microsoft.com/office/word/2006/wordml" xmlns:wps="http://schemas.microsoft.com/office/word/2010/wordprocessingShape" mc:Ignorable="w14 w15 w16se w16cid w16 w16cex w16sdtdh w16sdtfl cr w16du wp14">
+  <w16cex:commentExtensible w16cex:durableId="634853F7" w16cex:dateUtc="2026-04-15T01:24:00Z"/>
+  <w16cex:commentExtensible w16cex:durableId="716FBE3A" w16cex:dateUtc="2026-04-15T01:18:00Z"/>
+</w16cex:commentsExtensible>
+</file>
+
+<file path=word/commentsIds.xml><?xml version="1.0" encoding="utf-8"?>
+<w16cid:commentsIds xmlns:wpc="http://schemas.microsoft.com/office/word/2010/wordprocessingCanvas" xmlns:cx="http://schemas.microsoft.com/office/drawing/2014/chartex" xmlns:cx1="http://schemas.microsoft.com/office/drawing/2015/9/8/chartex" xmlns:cx2="http://schemas.microsoft.com/office/drawing/2015/10/21/chartex" xmlns:cx3="http://schemas.microsoft.com/office/drawing/2016/5/9/chartex" xmlns:cx4="http://schemas.microsoft.com/office/drawing/2016/5/10/chartex" xmlns:cx5="http://schemas.microsoft.com/office/drawing/2016/5/11/chartex" xmlns:cx6="http://schemas.microsoft.com/office/drawing/2016/5/12/chartex" xmlns:cx7="http://schemas.microsoft.com/office/drawing/2016/5/13/chartex" xmlns:cx8="http://schemas.microsoft.com/office/drawing/2016/5/14/chartex" xmlns:mc="http://schemas.openxmlformats.org/markup-compatibility/2006" xmlns:aink="http://schemas.microsoft.com/office/drawing/2016/ink" xmlns:am3d="http://schemas.microsoft.com/office/drawing/2017/model3d" xmlns:o="urn:schemas-microsoft-com:office:office" xmlns:oel="http://schemas.microsoft.com/office/2019/extlst" xmlns:r="http://schemas.openxmlformats.org/officeDocument/2006/relationships" xmlns:m="http://schemas.openxmlformats.org/officeDocument/2006/math" xmlns:v="urn:schemas-microsoft-com:vml" xmlns:wp14="http://schemas.microsoft.com/office/word/2010/wordprocessingDrawing" xmlns:wp="http://schemas.openxmlformats.org/drawingml/2006/wordprocessingDrawing" xmlns:w10="urn:schemas-microsoft-com:office:word" xmlns:w="http://schemas.openxmlformats.org/wordprocessingml/2006/main" xmlns:w14="http://schemas.microsoft.com/office/word/2010/wordml" xmlns:w15="http://schemas.microsoft.com/office/word/2012/wordml" xmlns:w16cex="http://schemas.microsoft.com/office/word/2018/wordml/cex" xmlns:w16cid="http://schemas.microsoft.com/office/word/2016/wordml/cid" xmlns:w16="http://schemas.microsoft.com/office/word/2018/wordml" xmlns:w16du="http://schemas.microsoft.com/office/word/2023/wordml/word16du" xmlns:w16sdtdh="http://schemas.microsoft.com/office/word/2020/wordml/sdtdatahash" xmlns:w16sdtfl="http://schemas.microsoft.com/office/word/2024/wordml/sdtformatlock" xmlns:w16se="http://schemas.microsoft.com/office/word/2015/wordml/symex" xmlns:wpg="http://schemas.microsoft.com/office/word/2010/wordprocessingGroup" xmlns:wpi="http://schemas.microsoft.com/office/word/2010/wordprocessingInk" xmlns:wne="http://schemas.microsoft.com/office/word/2006/wordml" xmlns:wps="http://schemas.microsoft.com/office/word/2010/wordprocessingShape" mc:Ignorable="w14 w15 w16se w16cid w16 w16cex w16sdtdh w16sdtfl w16du wp14">
+  <w16cid:commentId w16cid:paraId="3AC99979" w16cid:durableId="634853F7"/>
+  <w16cid:commentId w16cid:paraId="63A57F59" w16cid:durableId="716FBE3A"/>
+</w16cid:commentsIds>
 </file>
 
 <file path=word/endnotes.xml><?xml version="1.0" encoding="utf-8"?>
@@ -4589,7 +6019,16 @@
         <w:sz w:val="21"/>
         <w:szCs w:val="21"/>
       </w:rPr>
-      <w:t xml:space="preserve"> de </w:t>
+      <w:t xml:space="preserve"> </w:t>
+    </w:r>
+    <w:r>
+      <w:rPr>
+        <w:rFonts w:ascii="Century Gothic" w:hAnsi="Century Gothic"/>
+        <w:color w:val="747474" w:themeColor="background2" w:themeShade="80"/>
+        <w:sz w:val="21"/>
+        <w:szCs w:val="21"/>
+      </w:rPr>
+      <w:t xml:space="preserve">de </w:t>
     </w:r>
     <w:r>
       <w:rPr>
@@ -4834,6 +6273,118 @@
     </w:lvl>
   </w:abstractNum>
   <w:abstractNum w:abstractNumId="1" w15:restartNumberingAfterBreak="0">
+    <w:nsid w:val="0FB422EA"/>
+    <w:multiLevelType w:val="hybridMultilevel"/>
+    <w:tmpl w:val="7D548324"/>
+    <w:lvl w:ilvl="0" w:tplc="9A66C13C">
+      <w:numFmt w:val="bullet"/>
+      <w:lvlText w:val="-"/>
+      <w:lvlJc w:val="left"/>
+      <w:pPr>
+        <w:ind w:left="720" w:hanging="360"/>
+      </w:pPr>
+      <w:rPr>
+        <w:rFonts w:ascii="Aptos" w:eastAsiaTheme="minorHAnsi" w:hAnsi="Aptos" w:cstheme="minorBidi" w:hint="default"/>
+      </w:rPr>
+    </w:lvl>
+    <w:lvl w:ilvl="1" w:tplc="04090003">
+      <w:start w:val="1"/>
+      <w:numFmt w:val="bullet"/>
+      <w:lvlText w:val="o"/>
+      <w:lvlJc w:val="left"/>
+      <w:pPr>
+        <w:ind w:left="1440" w:hanging="360"/>
+      </w:pPr>
+      <w:rPr>
+        <w:rFonts w:ascii="Courier New" w:hAnsi="Courier New" w:cs="Courier New" w:hint="default"/>
+      </w:rPr>
+    </w:lvl>
+    <w:lvl w:ilvl="2" w:tplc="04090005" w:tentative="1">
+      <w:start w:val="1"/>
+      <w:numFmt w:val="bullet"/>
+      <w:lvlText w:val=""/>
+      <w:lvlJc w:val="left"/>
+      <w:pPr>
+        <w:ind w:left="2160" w:hanging="360"/>
+      </w:pPr>
+      <w:rPr>
+        <w:rFonts w:ascii="Wingdings" w:hAnsi="Wingdings" w:hint="default"/>
+      </w:rPr>
+    </w:lvl>
+    <w:lvl w:ilvl="3" w:tplc="04090001" w:tentative="1">
+      <w:start w:val="1"/>
+      <w:numFmt w:val="bullet"/>
+      <w:lvlText w:val=""/>
+      <w:lvlJc w:val="left"/>
+      <w:pPr>
+        <w:ind w:left="2880" w:hanging="360"/>
+      </w:pPr>
+      <w:rPr>
+        <w:rFonts w:ascii="Symbol" w:hAnsi="Symbol" w:hint="default"/>
+      </w:rPr>
+    </w:lvl>
+    <w:lvl w:ilvl="4" w:tplc="04090003" w:tentative="1">
+      <w:start w:val="1"/>
+      <w:numFmt w:val="bullet"/>
+      <w:lvlText w:val="o"/>
+      <w:lvlJc w:val="left"/>
+      <w:pPr>
+        <w:ind w:left="3600" w:hanging="360"/>
+      </w:pPr>
+      <w:rPr>
+        <w:rFonts w:ascii="Courier New" w:hAnsi="Courier New" w:cs="Courier New" w:hint="default"/>
+      </w:rPr>
+    </w:lvl>
+    <w:lvl w:ilvl="5" w:tplc="04090005" w:tentative="1">
+      <w:start w:val="1"/>
+      <w:numFmt w:val="bullet"/>
+      <w:lvlText w:val=""/>
+      <w:lvlJc w:val="left"/>
+      <w:pPr>
+        <w:ind w:left="4320" w:hanging="360"/>
+      </w:pPr>
+      <w:rPr>
+        <w:rFonts w:ascii="Wingdings" w:hAnsi="Wingdings" w:hint="default"/>
+      </w:rPr>
+    </w:lvl>
+    <w:lvl w:ilvl="6" w:tplc="04090001" w:tentative="1">
+      <w:start w:val="1"/>
+      <w:numFmt w:val="bullet"/>
+      <w:lvlText w:val=""/>
+      <w:lvlJc w:val="left"/>
+      <w:pPr>
+        <w:ind w:left="5040" w:hanging="360"/>
+      </w:pPr>
+      <w:rPr>
+        <w:rFonts w:ascii="Symbol" w:hAnsi="Symbol" w:hint="default"/>
+      </w:rPr>
+    </w:lvl>
+    <w:lvl w:ilvl="7" w:tplc="04090003" w:tentative="1">
+      <w:start w:val="1"/>
+      <w:numFmt w:val="bullet"/>
+      <w:lvlText w:val="o"/>
+      <w:lvlJc w:val="left"/>
+      <w:pPr>
+        <w:ind w:left="5760" w:hanging="360"/>
+      </w:pPr>
+      <w:rPr>
+        <w:rFonts w:ascii="Courier New" w:hAnsi="Courier New" w:cs="Courier New" w:hint="default"/>
+      </w:rPr>
+    </w:lvl>
+    <w:lvl w:ilvl="8" w:tplc="04090005" w:tentative="1">
+      <w:start w:val="1"/>
+      <w:numFmt w:val="bullet"/>
+      <w:lvlText w:val=""/>
+      <w:lvlJc w:val="left"/>
+      <w:pPr>
+        <w:ind w:left="6480" w:hanging="360"/>
+      </w:pPr>
+      <w:rPr>
+        <w:rFonts w:ascii="Wingdings" w:hAnsi="Wingdings" w:hint="default"/>
+      </w:rPr>
+    </w:lvl>
+  </w:abstractNum>
+  <w:abstractNum w:abstractNumId="2" w15:restartNumberingAfterBreak="0">
     <w:nsid w:val="114B0C57"/>
     <w:multiLevelType w:val="multilevel"/>
     <w:tmpl w:val="3D52BF64"/>
@@ -4982,7 +6533,7 @@
       </w:rPr>
     </w:lvl>
   </w:abstractNum>
-  <w:abstractNum w:abstractNumId="2" w15:restartNumberingAfterBreak="0">
+  <w:abstractNum w:abstractNumId="3" w15:restartNumberingAfterBreak="0">
     <w:nsid w:val="251B3235"/>
     <w:multiLevelType w:val="multilevel"/>
     <w:tmpl w:val="C534CDF0"/>
@@ -5131,7 +6682,7 @@
       </w:rPr>
     </w:lvl>
   </w:abstractNum>
-  <w:abstractNum w:abstractNumId="3" w15:restartNumberingAfterBreak="0">
+  <w:abstractNum w:abstractNumId="4" w15:restartNumberingAfterBreak="0">
     <w:nsid w:val="3A6F70AD"/>
     <w:multiLevelType w:val="multilevel"/>
     <w:tmpl w:val="B742134A"/>
@@ -5280,7 +6831,7 @@
       </w:rPr>
     </w:lvl>
   </w:abstractNum>
-  <w:abstractNum w:abstractNumId="4" w15:restartNumberingAfterBreak="0">
+  <w:abstractNum w:abstractNumId="5" w15:restartNumberingAfterBreak="0">
     <w:nsid w:val="42811DCA"/>
     <w:multiLevelType w:val="multilevel"/>
     <w:tmpl w:val="F86E2434"/>
@@ -5429,7 +6980,7 @@
       </w:rPr>
     </w:lvl>
   </w:abstractNum>
-  <w:abstractNum w:abstractNumId="5" w15:restartNumberingAfterBreak="0">
+  <w:abstractNum w:abstractNumId="6" w15:restartNumberingAfterBreak="0">
     <w:nsid w:val="45911C27"/>
     <w:multiLevelType w:val="multilevel"/>
     <w:tmpl w:val="867CE6C8"/>
@@ -5578,7 +7129,7 @@
       </w:rPr>
     </w:lvl>
   </w:abstractNum>
-  <w:abstractNum w:abstractNumId="6" w15:restartNumberingAfterBreak="0">
+  <w:abstractNum w:abstractNumId="7" w15:restartNumberingAfterBreak="0">
     <w:nsid w:val="479C5C99"/>
     <w:multiLevelType w:val="multilevel"/>
     <w:tmpl w:val="414ED4A4"/>
@@ -5727,7 +7278,7 @@
       </w:rPr>
     </w:lvl>
   </w:abstractNum>
-  <w:abstractNum w:abstractNumId="7" w15:restartNumberingAfterBreak="0">
+  <w:abstractNum w:abstractNumId="8" w15:restartNumberingAfterBreak="0">
     <w:nsid w:val="56D44C33"/>
     <w:multiLevelType w:val="multilevel"/>
     <w:tmpl w:val="21901168"/>
@@ -5876,7 +7427,7 @@
       </w:rPr>
     </w:lvl>
   </w:abstractNum>
-  <w:abstractNum w:abstractNumId="8" w15:restartNumberingAfterBreak="0">
+  <w:abstractNum w:abstractNumId="9" w15:restartNumberingAfterBreak="0">
     <w:nsid w:val="5AA94F92"/>
     <w:multiLevelType w:val="multilevel"/>
     <w:tmpl w:val="911A4034"/>
@@ -6025,7 +7576,7 @@
       </w:rPr>
     </w:lvl>
   </w:abstractNum>
-  <w:abstractNum w:abstractNumId="9" w15:restartNumberingAfterBreak="0">
+  <w:abstractNum w:abstractNumId="10" w15:restartNumberingAfterBreak="0">
     <w:nsid w:val="6DCC0A00"/>
     <w:multiLevelType w:val="multilevel"/>
     <w:tmpl w:val="A0820250"/>
@@ -6175,37 +7726,48 @@
     </w:lvl>
   </w:abstractNum>
   <w:num w:numId="1" w16cid:durableId="738211735">
-    <w:abstractNumId w:val="3"/>
+    <w:abstractNumId w:val="4"/>
   </w:num>
   <w:num w:numId="2" w16cid:durableId="330791910">
-    <w:abstractNumId w:val="6"/>
+    <w:abstractNumId w:val="7"/>
   </w:num>
   <w:num w:numId="3" w16cid:durableId="14428028">
-    <w:abstractNumId w:val="9"/>
+    <w:abstractNumId w:val="10"/>
   </w:num>
   <w:num w:numId="4" w16cid:durableId="608464051">
     <w:abstractNumId w:val="0"/>
   </w:num>
   <w:num w:numId="5" w16cid:durableId="1194266359">
+    <w:abstractNumId w:val="9"/>
+  </w:num>
+  <w:num w:numId="6" w16cid:durableId="112215491">
     <w:abstractNumId w:val="8"/>
   </w:num>
-  <w:num w:numId="6" w16cid:durableId="112215491">
-    <w:abstractNumId w:val="7"/>
-  </w:num>
   <w:num w:numId="7" w16cid:durableId="2129734293">
-    <w:abstractNumId w:val="1"/>
+    <w:abstractNumId w:val="2"/>
   </w:num>
   <w:num w:numId="8" w16cid:durableId="658465650">
-    <w:abstractNumId w:val="4"/>
+    <w:abstractNumId w:val="5"/>
   </w:num>
   <w:num w:numId="9" w16cid:durableId="90901381">
-    <w:abstractNumId w:val="5"/>
+    <w:abstractNumId w:val="6"/>
   </w:num>
   <w:num w:numId="10" w16cid:durableId="2104304248">
-    <w:abstractNumId w:val="2"/>
+    <w:abstractNumId w:val="3"/>
+  </w:num>
+  <w:num w:numId="11" w16cid:durableId="697850240">
+    <w:abstractNumId w:val="1"/>
   </w:num>
   <w:numIdMacAtCleanup w:val="10"/>
 </w:numbering>
+</file>
+
+<file path=word/people.xml><?xml version="1.0" encoding="utf-8"?>
+<w15:people xmlns:wpc="http://schemas.microsoft.com/office/word/2010/wordprocessingCanvas" xmlns:cx="http://schemas.microsoft.com/office/drawing/2014/chartex" xmlns:cx1="http://schemas.microsoft.com/office/drawing/2015/9/8/chartex" xmlns:cx2="http://schemas.microsoft.com/office/drawing/2015/10/21/chartex" xmlns:cx3="http://schemas.microsoft.com/office/drawing/2016/5/9/chartex" xmlns:cx4="http://schemas.microsoft.com/office/drawing/2016/5/10/chartex" xmlns:cx5="http://schemas.microsoft.com/office/drawing/2016/5/11/chartex" xmlns:cx6="http://schemas.microsoft.com/office/drawing/2016/5/12/chartex" xmlns:cx7="http://schemas.microsoft.com/office/drawing/2016/5/13/chartex" xmlns:cx8="http://schemas.microsoft.com/office/drawing/2016/5/14/chartex" xmlns:mc="http://schemas.openxmlformats.org/markup-compatibility/2006" xmlns:aink="http://schemas.microsoft.com/office/drawing/2016/ink" xmlns:am3d="http://schemas.microsoft.com/office/drawing/2017/model3d" xmlns:o="urn:schemas-microsoft-com:office:office" xmlns:oel="http://schemas.microsoft.com/office/2019/extlst" xmlns:r="http://schemas.openxmlformats.org/officeDocument/2006/relationships" xmlns:m="http://schemas.openxmlformats.org/officeDocument/2006/math" xmlns:v="urn:schemas-microsoft-com:vml" xmlns:wp14="http://schemas.microsoft.com/office/word/2010/wordprocessingDrawing" xmlns:wp="http://schemas.openxmlformats.org/drawingml/2006/wordprocessingDrawing" xmlns:w10="urn:schemas-microsoft-com:office:word" xmlns:w="http://schemas.openxmlformats.org/wordprocessingml/2006/main" xmlns:w14="http://schemas.microsoft.com/office/word/2010/wordml" xmlns:w15="http://schemas.microsoft.com/office/word/2012/wordml" xmlns:w16cex="http://schemas.microsoft.com/office/word/2018/wordml/cex" xmlns:w16cid="http://schemas.microsoft.com/office/word/2016/wordml/cid" xmlns:w16="http://schemas.microsoft.com/office/word/2018/wordml" xmlns:w16du="http://schemas.microsoft.com/office/word/2023/wordml/word16du" xmlns:w16sdtdh="http://schemas.microsoft.com/office/word/2020/wordml/sdtdatahash" xmlns:w16sdtfl="http://schemas.microsoft.com/office/word/2024/wordml/sdtformatlock" xmlns:w16se="http://schemas.microsoft.com/office/word/2015/wordml/symex" xmlns:wpg="http://schemas.microsoft.com/office/word/2010/wordprocessingGroup" xmlns:wpi="http://schemas.microsoft.com/office/word/2010/wordprocessingInk" xmlns:wne="http://schemas.microsoft.com/office/word/2006/wordml" xmlns:wps="http://schemas.microsoft.com/office/word/2010/wordprocessingShape" mc:Ignorable="w14 w15 w16se w16cid w16 w16cex w16sdtdh w16sdtfl w16du wp14">
+  <w15:person w15:author="Giuliana Alvaro">
+    <w15:presenceInfo w15:providerId="Windows Live" w15:userId="6f58ab7e06d71cc7"/>
+  </w15:person>
+</w15:people>
 </file>
 
 <file path=word/styles.xml><?xml version="1.0" encoding="utf-8"?>
@@ -6217,7 +7779,7 @@
         <w:kern w:val="2"/>
         <w:sz w:val="24"/>
         <w:szCs w:val="24"/>
-        <w:lang w:eastAsia="en-US" w:bidi="ar-SA"/>
+        <w:lang w:val="en-AR" w:eastAsia="en-US" w:bidi="ar-SA"/>
         <w14:ligatures w14:val="standardContextual"/>
       </w:rPr>
     </w:rPrDefault>
@@ -7270,6 +8832,74 @@
       <w:u w:val="single"/>
     </w:rPr>
   </w:style>
+  <w:style w:type="character" w:styleId="CommentReference">
+    <w:name w:val="annotation reference"/>
+    <w:basedOn w:val="DefaultParagraphFont"/>
+    <w:uiPriority w:val="99"/>
+    <w:semiHidden/>
+    <w:unhideWhenUsed/>
+    <w:rsid w:val="008823EB"/>
+    <w:rPr>
+      <w:sz w:val="16"/>
+      <w:szCs w:val="16"/>
+    </w:rPr>
+  </w:style>
+  <w:style w:type="paragraph" w:styleId="CommentText">
+    <w:name w:val="annotation text"/>
+    <w:basedOn w:val="Normal"/>
+    <w:link w:val="CommentTextChar"/>
+    <w:uiPriority w:val="99"/>
+    <w:semiHidden/>
+    <w:unhideWhenUsed/>
+    <w:rsid w:val="008823EB"/>
+    <w:pPr>
+      <w:spacing w:line="240" w:lineRule="auto"/>
+    </w:pPr>
+    <w:rPr>
+      <w:sz w:val="20"/>
+      <w:szCs w:val="20"/>
+    </w:rPr>
+  </w:style>
+  <w:style w:type="character" w:customStyle="1" w:styleId="CommentTextChar">
+    <w:name w:val="Comment Text Char"/>
+    <w:basedOn w:val="DefaultParagraphFont"/>
+    <w:link w:val="CommentText"/>
+    <w:uiPriority w:val="99"/>
+    <w:semiHidden/>
+    <w:rsid w:val="008823EB"/>
+    <w:rPr>
+      <w:sz w:val="20"/>
+      <w:szCs w:val="20"/>
+    </w:rPr>
+  </w:style>
+  <w:style w:type="paragraph" w:styleId="CommentSubject">
+    <w:name w:val="annotation subject"/>
+    <w:basedOn w:val="CommentText"/>
+    <w:next w:val="CommentText"/>
+    <w:link w:val="CommentSubjectChar"/>
+    <w:uiPriority w:val="99"/>
+    <w:semiHidden/>
+    <w:unhideWhenUsed/>
+    <w:rsid w:val="008823EB"/>
+    <w:rPr>
+      <w:b/>
+      <w:bCs/>
+    </w:rPr>
+  </w:style>
+  <w:style w:type="character" w:customStyle="1" w:styleId="CommentSubjectChar">
+    <w:name w:val="Comment Subject Char"/>
+    <w:basedOn w:val="CommentTextChar"/>
+    <w:link w:val="CommentSubject"/>
+    <w:uiPriority w:val="99"/>
+    <w:semiHidden/>
+    <w:rsid w:val="008823EB"/>
+    <w:rPr>
+      <w:b/>
+      <w:bCs/>
+      <w:sz w:val="20"/>
+      <w:szCs w:val="20"/>
+    </w:rPr>
+  </w:style>
 </w:styles>
 </file>
 

</xml_diff>

<commit_message>
feat: puntos 3-6 con transformacion logaritmica y grid search SARIMA-X
- Punto 3: FAS/FAC/FACP sobre series en log (log_subte, log_peajes, lluvia)
- Punto 5: grid search 36 combinaciones SARIMA(p,1,q)(P,1,Q)[12]-X
  - Subte best: SARIMA(0,1,2)(0,1,1)[12], exog: lluvia_mm + dummy_covid
  - Peajes best: SARIMA(1,1,2)(1,1,1)[12], exog: lluvia_mm + dummy_covid
- Punto 6: evaluacion estatica + Rolling Forecast Origin, metricas en escala original
- Transformacion log aplicada para manejar quiebre estructural post-COVID

Co-Authored-By: Claude Sonnet 4.6 <noreply@anthropic.com>
</commit_message>
<xml_diff>
--- a/Archivos finales/TP_Series_Temporales.docx
+++ b/Archivos finales/TP_Series_Temporales.docx
@@ -601,7 +601,6 @@
                                     <w:dataBinding w:prefixMappings="xmlns:ns0='http://purl.org/dc/elements/1.1/' xmlns:ns1='http://schemas.openxmlformats.org/package/2006/metadata/core-properties' " w:xpath="/ns1:coreProperties[1]/ns0:title[1]" w:storeItemID="{6C3C8BC8-F283-45AE-878A-BAB7291924A1}"/>
                                     <w:text/>
                                   </w:sdtPr>
-                                  <w:sdtEndPr/>
                                   <w:sdtContent>
                                     <w:r>
                                       <w:rPr>
@@ -672,7 +671,6 @@
                               <w:dataBinding w:prefixMappings="xmlns:ns0='http://purl.org/dc/elements/1.1/' xmlns:ns1='http://schemas.openxmlformats.org/package/2006/metadata/core-properties' " w:xpath="/ns1:coreProperties[1]/ns0:title[1]" w:storeItemID="{6C3C8BC8-F283-45AE-878A-BAB7291924A1}"/>
                               <w:text/>
                             </w:sdtPr>
-                            <w:sdtEndPr/>
                             <w:sdtContent>
                               <w:r>
                                 <w:rPr>
@@ -830,8 +828,16 @@
     </w:p>
     <w:p>
       <w:pPr>
-        <w:pStyle w:val="Heading1"/>
-        <w:spacing w:before="240"/>
+        <w:rPr>
+          <w:rFonts w:ascii="Century Gothic" w:eastAsiaTheme="majorEastAsia" w:hAnsi="Century Gothic" w:cstheme="majorBidi"/>
+          <w:b/>
+          <w:bCs/>
+          <w:color w:val="152186"/>
+          <w:sz w:val="28"/>
+          <w:szCs w:val="28"/>
+        </w:rPr>
+      </w:pPr>
+      <w:r>
         <w:rPr>
           <w:rFonts w:ascii="Century Gothic" w:hAnsi="Century Gothic"/>
           <w:b/>
@@ -840,8 +846,13 @@
           <w:sz w:val="28"/>
           <w:szCs w:val="28"/>
         </w:rPr>
-      </w:pPr>
-      <w:r>
+        <w:br w:type="page"/>
+      </w:r>
+    </w:p>
+    <w:p>
+      <w:pPr>
+        <w:pStyle w:val="Heading1"/>
+        <w:spacing w:before="240"/>
         <w:rPr>
           <w:rFonts w:ascii="Century Gothic" w:hAnsi="Century Gothic"/>
           <w:b/>
@@ -850,6 +861,17 @@
           <w:sz w:val="28"/>
           <w:szCs w:val="28"/>
         </w:rPr>
+      </w:pPr>
+      <w:r>
+        <w:rPr>
+          <w:rFonts w:ascii="Century Gothic" w:hAnsi="Century Gothic"/>
+          <w:b/>
+          <w:bCs/>
+          <w:color w:val="152186"/>
+          <w:sz w:val="28"/>
+          <w:szCs w:val="28"/>
+        </w:rPr>
+        <w:lastRenderedPageBreak/>
         <w:t xml:space="preserve">Funciones de </w:t>
       </w:r>
       <w:r>
@@ -1220,7 +1242,6 @@
           <w:sz w:val="22"/>
           <w:szCs w:val="22"/>
         </w:rPr>
-        <w:lastRenderedPageBreak/>
         <w:t>Análisis serie Subte – pasajeros mensuales</w:t>
       </w:r>
     </w:p>
@@ -1462,6 +1483,7 @@
           <w:sz w:val="22"/>
           <w:szCs w:val="22"/>
         </w:rPr>
+        <w:lastRenderedPageBreak/>
         <w:t xml:space="preserve">Sin embargo, </w:t>
       </w:r>
       <w:r>
@@ -1655,158 +1677,131 @@
     </w:p>
     <w:p>
       <w:pPr>
-        <w:spacing w:line="276" w:lineRule="auto"/>
+        <w:pStyle w:val="Heading2"/>
         <w:jc w:val="both"/>
         <w:rPr>
-          <w:sz w:val="22"/>
-          <w:szCs w:val="22"/>
-        </w:rPr>
-      </w:pPr>
-      <w:r>
-        <w:rPr>
-          <w:sz w:val="22"/>
-          <w:szCs w:val="22"/>
-        </w:rPr>
-        <w:t>La FAS muestra un comportamiento estable con baja variabilidad entre 2013 y 2019</w:t>
-      </w:r>
-      <w:r>
-        <w:rPr>
-          <w:sz w:val="22"/>
-          <w:szCs w:val="22"/>
-        </w:rPr>
-        <w:t xml:space="preserve"> para la serie de Peajes,</w:t>
-      </w:r>
-      <w:r>
-        <w:rPr>
-          <w:sz w:val="22"/>
-          <w:szCs w:val="22"/>
-        </w:rPr>
-        <w:t xml:space="preserve"> seguido de un colapso prácticamente total durante 2020 y una recuperación</w:t>
-      </w:r>
-      <w:r>
-        <w:rPr>
-          <w:sz w:val="22"/>
-          <w:szCs w:val="22"/>
-        </w:rPr>
-        <w:t xml:space="preserve"> </w:t>
-      </w:r>
-      <w:r>
-        <w:rPr>
-          <w:sz w:val="22"/>
-          <w:szCs w:val="22"/>
-        </w:rPr>
-        <w:t xml:space="preserve">volátil con niveles crecientes hacia 2025. El quiebre estructural producido por el COVID es más severo que en el </w:t>
-      </w:r>
-      <w:r>
-        <w:rPr>
-          <w:sz w:val="22"/>
-          <w:szCs w:val="22"/>
-        </w:rPr>
-        <w:t>S</w:t>
-      </w:r>
-      <w:r>
-        <w:rPr>
-          <w:sz w:val="22"/>
-          <w:szCs w:val="22"/>
-        </w:rPr>
-        <w:t>ubte, lo que tiene sentido dado que el transporte automotor fue más afectado por las restricciones de circulación.</w:t>
-      </w:r>
-    </w:p>
-    <w:p>
-      <w:pPr>
-        <w:spacing w:line="276" w:lineRule="auto"/>
+          <w:rFonts w:asciiTheme="minorHAnsi" w:eastAsiaTheme="minorHAnsi" w:hAnsiTheme="minorHAnsi" w:cstheme="minorBidi"/>
+          <w:color w:val="auto"/>
+          <w:sz w:val="22"/>
+          <w:szCs w:val="22"/>
+        </w:rPr>
+      </w:pPr>
+      <w:r>
+        <w:rPr>
+          <w:rFonts w:asciiTheme="minorHAnsi" w:eastAsiaTheme="minorHAnsi" w:hAnsiTheme="minorHAnsi" w:cstheme="minorBidi"/>
+          <w:color w:val="auto"/>
+          <w:sz w:val="22"/>
+          <w:szCs w:val="22"/>
+        </w:rPr>
+        <w:t>Al realizar el análisis de la serie original, la FAC no presenta el patrón de decaimiento lento típico de una raíz unitaria, sino que parte de ~0.7 y oscila hacia valores negativos, llegando a -0.5 en los rezagos 15-30. Este comportamiento se explica por el quiebre estructural del COVID: el colapso casi total del tránsito en 2020 seguido de una recuperación a niveles superiores a los previos genera autocorrelaciones de signo alternado que distorsionan la función. La FACP muestra spikes significativos en los rezagos 1 y 2.</w:t>
+      </w:r>
+    </w:p>
+    <w:p>
+      <w:pPr>
+        <w:pStyle w:val="Heading2"/>
         <w:jc w:val="both"/>
         <w:rPr>
-          <w:sz w:val="22"/>
-          <w:szCs w:val="22"/>
-        </w:rPr>
-      </w:pPr>
-      <w:r>
-        <w:rPr>
-          <w:sz w:val="22"/>
-          <w:szCs w:val="22"/>
-        </w:rPr>
-        <w:t>La FAC</w:t>
-      </w:r>
-      <w:r>
-        <w:rPr>
-          <w:sz w:val="22"/>
-          <w:szCs w:val="22"/>
-        </w:rPr>
-        <w:t xml:space="preserve"> </w:t>
-      </w:r>
-      <w:r>
-        <w:rPr>
-          <w:sz w:val="22"/>
-          <w:szCs w:val="22"/>
-        </w:rPr>
-        <w:t>exhibe el patrón más llamativo del conjunto</w:t>
-      </w:r>
-      <w:r>
-        <w:rPr>
-          <w:sz w:val="22"/>
-          <w:szCs w:val="22"/>
-        </w:rPr>
-        <w:t xml:space="preserve">, ya que </w:t>
-      </w:r>
-      <w:r>
-        <w:rPr>
-          <w:sz w:val="22"/>
-          <w:szCs w:val="22"/>
-        </w:rPr>
-        <w:t>comienza en ~0.7, decae rápidamente y luego oscila hacia valores negativos (llegando a -0.5 en los rezagos 20-30). Este comportamiento no corresponde a un proceso ARIMA estándar, sino que es la consecuencia directa del quiebre estructural: el colapso y posterior recuperación de la serie en niveles superiores a los previos genera autocorrelaciones de signo alternado. Esto indica que la variable dummy de COVID es indispensable</w:t>
-      </w:r>
-      <w:r>
-        <w:rPr>
-          <w:sz w:val="22"/>
-          <w:szCs w:val="22"/>
-        </w:rPr>
-        <w:t xml:space="preserve"> </w:t>
-      </w:r>
-      <w:r>
-        <w:rPr>
-          <w:sz w:val="22"/>
-          <w:szCs w:val="22"/>
-        </w:rPr>
-        <w:t>en el modelo para aislar el efecto pandémico de la dinámica subyacente de la serie.</w:t>
-      </w:r>
-    </w:p>
-    <w:p>
-      <w:pPr>
-        <w:spacing w:line="276" w:lineRule="auto"/>
+          <w:rFonts w:asciiTheme="minorHAnsi" w:eastAsiaTheme="minorHAnsi" w:hAnsiTheme="minorHAnsi" w:cstheme="minorBidi"/>
+          <w:color w:val="auto"/>
+          <w:sz w:val="22"/>
+          <w:szCs w:val="22"/>
+        </w:rPr>
+      </w:pPr>
+      <w:r>
+        <w:rPr>
+          <w:rFonts w:asciiTheme="minorHAnsi" w:eastAsiaTheme="minorHAnsi" w:hAnsiTheme="minorHAnsi" w:cstheme="minorBidi"/>
+          <w:color w:val="auto"/>
+          <w:sz w:val="22"/>
+          <w:szCs w:val="22"/>
+          <w:highlight w:val="yellow"/>
+        </w:rPr>
+        <w:t>GRAFICO SERIE ORIGINAL</w:t>
+      </w:r>
+    </w:p>
+    <w:p>
+      <w:pPr>
+        <w:pStyle w:val="Heading2"/>
         <w:jc w:val="both"/>
         <w:rPr>
-          <w:sz w:val="22"/>
-          <w:szCs w:val="22"/>
-        </w:rPr>
-      </w:pPr>
-      <w:r>
-        <w:rPr>
-          <w:sz w:val="22"/>
-          <w:szCs w:val="22"/>
-        </w:rPr>
-        <w:t xml:space="preserve">Finalmente, la </w:t>
-      </w:r>
-      <w:r>
-        <w:rPr>
-          <w:sz w:val="22"/>
-          <w:szCs w:val="22"/>
-        </w:rPr>
-        <w:t xml:space="preserve">FACP presenta un </w:t>
-      </w:r>
-      <w:r>
-        <w:rPr>
-          <w:sz w:val="22"/>
-          <w:szCs w:val="22"/>
-        </w:rPr>
-        <w:t>pico</w:t>
-      </w:r>
-      <w:r>
-        <w:rPr>
-          <w:sz w:val="22"/>
-          <w:szCs w:val="22"/>
-        </w:rPr>
-        <w:t xml:space="preserve"> en el lag 1, algunos rezagos significativos adicionales y luego decae a cero, orientando hacia un componente AR de orden bajo una vez corregido el quiebre estructural.</w:t>
+          <w:rFonts w:asciiTheme="minorHAnsi" w:eastAsiaTheme="minorHAnsi" w:hAnsiTheme="minorHAnsi" w:cstheme="minorBidi"/>
+          <w:color w:val="auto"/>
+          <w:sz w:val="22"/>
+          <w:szCs w:val="22"/>
+        </w:rPr>
+      </w:pPr>
+      <w:r>
+        <w:rPr>
+          <w:rFonts w:asciiTheme="minorHAnsi" w:eastAsiaTheme="minorHAnsi" w:hAnsiTheme="minorHAnsi" w:cstheme="minorBidi"/>
+          <w:color w:val="auto"/>
+          <w:sz w:val="22"/>
+          <w:szCs w:val="22"/>
+        </w:rPr>
+        <w:t>Una vez aplicada la primera diferencia, tanto la FAC como la FACP presentan un spike de magnitud ~-0.75 en el LAG 1 que domina completamente ambas funciones. Este spike no representa estructura ARIMA real sino que es el outlier del COVID amplificado por la diferenciación: el cambio mes a mes durante el colapso y la recuperación es tan extremo que absorbe toda la señal de autocorrelación.</w:t>
+      </w:r>
+    </w:p>
+    <w:p>
+      <w:pPr>
+        <w:pStyle w:val="Heading2"/>
+        <w:jc w:val="both"/>
+        <w:rPr>
+          <w:rFonts w:asciiTheme="minorHAnsi" w:eastAsiaTheme="minorHAnsi" w:hAnsiTheme="minorHAnsi" w:cstheme="minorBidi"/>
+          <w:color w:val="auto"/>
+          <w:sz w:val="22"/>
+          <w:szCs w:val="22"/>
+        </w:rPr>
+      </w:pPr>
+      <w:r>
+        <w:rPr>
+          <w:rFonts w:asciiTheme="minorHAnsi" w:eastAsiaTheme="minorHAnsi" w:hAnsiTheme="minorHAnsi" w:cstheme="minorBidi"/>
+          <w:color w:val="auto"/>
+          <w:sz w:val="22"/>
+          <w:szCs w:val="22"/>
+          <w:highlight w:val="yellow"/>
+        </w:rPr>
+        <w:t>GRAFICO d=1</w:t>
+      </w:r>
+    </w:p>
+    <w:p>
+      <w:pPr>
+        <w:pStyle w:val="Heading2"/>
+        <w:jc w:val="both"/>
+        <w:rPr>
+          <w:rFonts w:asciiTheme="minorHAnsi" w:eastAsiaTheme="minorHAnsi" w:hAnsiTheme="minorHAnsi" w:cstheme="minorBidi"/>
+          <w:color w:val="auto"/>
+          <w:sz w:val="22"/>
+          <w:szCs w:val="22"/>
+        </w:rPr>
+      </w:pPr>
+      <w:r>
+        <w:rPr>
+          <w:rFonts w:asciiTheme="minorHAnsi" w:eastAsiaTheme="minorHAnsi" w:hAnsiTheme="minorHAnsi" w:cstheme="minorBidi"/>
+          <w:color w:val="auto"/>
+          <w:sz w:val="22"/>
+          <w:szCs w:val="22"/>
+        </w:rPr>
+        <w:t>Al aplicar adicionalmente la diferenciación estacional (D=1, s=12), el spike del LAG 1 se mantiene con magnitud similar (~-0.5), confirmando que la diferenciación por sí sola no es suficiente para aislar la estructura subyacente de la serie. A diferencia del subte, donde la diferenciación revela los órdenes p, q, P, Q, en la serie de peajes el quiebre estructural contamina todas las etapas del análisis, haciendo imposible identificar los parámetros del modelo a partir de los gráficos. Por este motivo, la incorporación de una variable dummy COVID es indispensable, y los órdenes del modelo serán determinados mediante grilla AIC/BIC con el dummy incluido en el Punto 5.</w:t>
+      </w:r>
+    </w:p>
+    <w:p>
+      <w:pPr>
+        <w:pStyle w:val="Heading2"/>
+        <w:jc w:val="both"/>
+        <w:rPr>
+          <w:rFonts w:asciiTheme="minorHAnsi" w:eastAsiaTheme="minorHAnsi" w:hAnsiTheme="minorHAnsi" w:cstheme="minorBidi"/>
+          <w:color w:val="auto"/>
+          <w:sz w:val="22"/>
+          <w:szCs w:val="22"/>
+        </w:rPr>
+      </w:pPr>
+      <w:r>
+        <w:rPr>
+          <w:rFonts w:asciiTheme="minorHAnsi" w:eastAsiaTheme="minorHAnsi" w:hAnsiTheme="minorHAnsi" w:cstheme="minorBidi"/>
+          <w:color w:val="auto"/>
+          <w:sz w:val="22"/>
+          <w:szCs w:val="22"/>
+          <w:highlight w:val="yellow"/>
+        </w:rPr>
+        <w:t>GRAFICOS D=1 s=12</w:t>
       </w:r>
     </w:p>
     <w:p>
@@ -1830,7 +1825,6 @@
           <w:sz w:val="22"/>
           <w:szCs w:val="22"/>
         </w:rPr>
-        <w:lastRenderedPageBreak/>
         <w:t>Análisis serie</w:t>
       </w:r>
       <w:r>
@@ -1901,6 +1895,7 @@
           <w:sz w:val="22"/>
           <w:szCs w:val="22"/>
         </w:rPr>
+        <w:lastRenderedPageBreak/>
         <w:t>Luego, l</w:t>
       </w:r>
       <w:r>
@@ -3499,13 +3494,8 @@
         <w:rPr>
           <w:noProof/>
         </w:rPr>
-      </w:r>
-      <w:r>
-        <w:rPr>
-          <w:noProof/>
-        </w:rPr>
         <w:pict w14:anchorId="7846A59A">
-          <v:rect id="_x0000_i1025" alt="" style="width:468pt;height:.05pt;mso-width-percent:0;mso-height-percent:0;mso-width-percent:0;mso-height-percent:0" o:hralign="center" o:hrstd="t" o:hr="t" fillcolor="#a0a0a0" stroked="f"/>
+          <v:rect id="_x0000_i1029" alt="" style="width:468pt;height:.05pt;mso-width-percent:0;mso-height-percent:0;mso-width-percent:0;mso-height-percent:0" o:hralign="center" o:hrstd="t" o:hr="t" fillcolor="#a0a0a0" stroked="f"/>
         </w:pict>
       </w:r>
     </w:p>
@@ -4698,13 +4688,8 @@
         <w:rPr>
           <w:noProof/>
         </w:rPr>
-      </w:r>
-      <w:r>
-        <w:rPr>
-          <w:noProof/>
-        </w:rPr>
         <w:pict w14:anchorId="494BEBD2">
-          <v:rect id="_x0000_i1026" alt="" style="width:468pt;height:.05pt;mso-width-percent:0;mso-height-percent:0;mso-width-percent:0;mso-height-percent:0" o:hralign="center" o:hrstd="t" o:hr="t" fillcolor="#a0a0a0" stroked="f"/>
+          <v:rect id="_x0000_i1028" alt="" style="width:468pt;height:.05pt;mso-width-percent:0;mso-height-percent:0;mso-width-percent:0;mso-height-percent:0" o:hralign="center" o:hrstd="t" o:hr="t" fillcolor="#a0a0a0" stroked="f"/>
         </w:pict>
       </w:r>
     </w:p>
@@ -5202,11 +5187,6 @@
       </w:pPr>
     </w:p>
     <w:p>
-      <w:r>
-        <w:rPr>
-          <w:noProof/>
-        </w:rPr>
-      </w:r>
       <w:r>
         <w:rPr>
           <w:noProof/>
@@ -5409,13 +5389,8 @@
         <w:rPr>
           <w:noProof/>
         </w:rPr>
-      </w:r>
-      <w:r>
-        <w:rPr>
-          <w:noProof/>
-        </w:rPr>
         <w:pict w14:anchorId="7EB6B688">
-          <v:rect id="_x0000_i1028" alt="" style="width:468pt;height:.05pt;mso-width-percent:0;mso-height-percent:0;mso-width-percent:0;mso-height-percent:0" o:hralign="center" o:hrstd="t" o:hr="t" fillcolor="#a0a0a0" stroked="f"/>
+          <v:rect id="_x0000_i1026" alt="" style="width:468pt;height:.05pt;mso-width-percent:0;mso-height-percent:0;mso-width-percent:0;mso-height-percent:0" o:hralign="center" o:hrstd="t" o:hr="t" fillcolor="#a0a0a0" stroked="f"/>
         </w:pict>
       </w:r>
     </w:p>
@@ -5720,13 +5695,8 @@
         <w:rPr>
           <w:noProof/>
         </w:rPr>
-      </w:r>
-      <w:r>
-        <w:rPr>
-          <w:noProof/>
-        </w:rPr>
         <w:pict w14:anchorId="42858AB3">
-          <v:rect id="_x0000_i1029" alt="" style="width:468pt;height:.05pt;mso-width-percent:0;mso-height-percent:0;mso-width-percent:0;mso-height-percent:0" o:hralign="center" o:hrstd="t" o:hr="t" fillcolor="#a0a0a0" stroked="f"/>
+          <v:rect id="_x0000_i1025" alt="" style="width:468pt;height:.05pt;mso-width-percent:0;mso-height-percent:0;mso-width-percent:0;mso-height-percent:0" o:hralign="center" o:hrstd="t" o:hr="t" fillcolor="#a0a0a0" stroked="f"/>
         </w:pict>
       </w:r>
     </w:p>
@@ -5754,13 +5724,6 @@
           <w:szCs w:val="22"/>
         </w:rPr>
       </w:pPr>
-      <w:r>
-        <w:rPr>
-          <w:sz w:val="22"/>
-          <w:szCs w:val="22"/>
-        </w:rPr>
-        <w:br w:type="page"/>
-      </w:r>
     </w:p>
     <w:p>
       <w:pPr>
@@ -6019,16 +5982,7 @@
         <w:sz w:val="21"/>
         <w:szCs w:val="21"/>
       </w:rPr>
-      <w:t xml:space="preserve"> </w:t>
-    </w:r>
-    <w:r>
-      <w:rPr>
-        <w:rFonts w:ascii="Century Gothic" w:hAnsi="Century Gothic"/>
-        <w:color w:val="747474" w:themeColor="background2" w:themeShade="80"/>
-        <w:sz w:val="21"/>
-        <w:szCs w:val="21"/>
-      </w:rPr>
-      <w:t xml:space="preserve">de </w:t>
+      <w:t xml:space="preserve"> de </w:t>
     </w:r>
     <w:r>
       <w:rPr>

</xml_diff>